<commit_message>
Update MLT landing content, styling, and images
</commit_message>
<xml_diff>
--- a/public/MASTER LIVE TRAINING LANDING.docx
+++ b/public/MASTER LIVE TRAINING LANDING.docx
@@ -2251,6 +2251,7 @@
           <w:rFonts w:ascii="Poppins" w:hAnsi="Poppins" w:cs="Poppins"/>
           <w:b/>
           <w:bCs/>
+          <w:color w:val="00B050"/>
         </w:rPr>
       </w:pPr>
       <w:r>
@@ -2258,6 +2259,7 @@
           <w:rFonts w:ascii="Poppins" w:hAnsi="Poppins" w:cs="Poppins"/>
           <w:b/>
           <w:bCs/>
+          <w:color w:val="00B050"/>
         </w:rPr>
         <w:t>Lo que podrás llevarte de esta experiencia</w:t>
       </w:r>
@@ -2268,20 +2270,23 @@
         <w:jc w:val="both"/>
         <w:rPr>
           <w:rFonts w:ascii="Poppins" w:hAnsi="Poppins" w:cs="Poppins"/>
-        </w:rPr>
-      </w:pPr>
-    </w:p>
-    <w:p>
-      <w:pPr>
-        <w:spacing w:after="0"/>
-        <w:jc w:val="both"/>
-        <w:rPr>
-          <w:rFonts w:ascii="Poppins" w:hAnsi="Poppins" w:cs="Poppins"/>
-        </w:rPr>
-      </w:pPr>
-      <w:r>
-        <w:rPr>
-          <w:rFonts w:ascii="Poppins" w:hAnsi="Poppins" w:cs="Poppins"/>
+          <w:color w:val="00B050"/>
+        </w:rPr>
+      </w:pPr>
+    </w:p>
+    <w:p>
+      <w:pPr>
+        <w:spacing w:after="0"/>
+        <w:jc w:val="both"/>
+        <w:rPr>
+          <w:rFonts w:ascii="Poppins" w:hAnsi="Poppins" w:cs="Poppins"/>
+          <w:color w:val="00B050"/>
+        </w:rPr>
+      </w:pPr>
+      <w:r>
+        <w:rPr>
+          <w:rFonts w:ascii="Poppins" w:hAnsi="Poppins" w:cs="Poppins"/>
+          <w:color w:val="00B050"/>
         </w:rPr>
         <w:t>Cada persona llega a Master Live Training con una historia, unos desafíos y unos objetivos diferentes. Sin embargo, existe algo que suele repetirse en quienes recorren un proceso profundo de desarrollo humano: comienzan a verse a sí mismos, a sus relaciones y a su vida desde una perspectiva completamente diferente.</w:t>
       </w:r>
@@ -2292,35 +2297,75 @@
         <w:jc w:val="both"/>
         <w:rPr>
           <w:rFonts w:ascii="Poppins" w:hAnsi="Poppins" w:cs="Poppins"/>
-        </w:rPr>
-      </w:pPr>
-    </w:p>
-    <w:p>
-      <w:pPr>
-        <w:spacing w:after="0"/>
-        <w:jc w:val="both"/>
-        <w:rPr>
-          <w:rFonts w:ascii="Poppins" w:hAnsi="Poppins" w:cs="Poppins"/>
-        </w:rPr>
-      </w:pPr>
-      <w:r>
-        <w:rPr>
-          <w:rFonts w:ascii="Poppins" w:hAnsi="Poppins" w:cs="Poppins"/>
-        </w:rPr>
-        <w:t>Al finalizar este proceso tendrás una comprensión mucho más clara de quién eres, cuáles son los patrones que impulsan o limitan tu crecimiento y qué aspectos de tu vida requieren mayor atención para alcanzar el siguiente nivel de desarrollo.</w:t>
-      </w:r>
-    </w:p>
-    <w:p>
-      <w:pPr>
-        <w:spacing w:after="0"/>
-        <w:jc w:val="both"/>
-        <w:rPr>
-          <w:rFonts w:ascii="Poppins" w:hAnsi="Poppins" w:cs="Poppins"/>
-        </w:rPr>
-      </w:pPr>
-      <w:r>
-        <w:rPr>
-          <w:rFonts w:ascii="Poppins" w:hAnsi="Poppins" w:cs="Poppins"/>
+          <w:color w:val="00B050"/>
+        </w:rPr>
+      </w:pPr>
+    </w:p>
+    <w:p>
+      <w:pPr>
+        <w:spacing w:after="0"/>
+        <w:jc w:val="both"/>
+        <w:rPr>
+          <w:rFonts w:ascii="Poppins" w:hAnsi="Poppins" w:cs="Poppins"/>
+          <w:color w:val="00B050"/>
+        </w:rPr>
+      </w:pPr>
+      <w:r>
+        <w:rPr>
+          <w:rFonts w:ascii="Poppins" w:hAnsi="Poppins" w:cs="Poppins"/>
+          <w:color w:val="00B050"/>
+        </w:rPr>
+        <w:t>Al finalizar este proceso tendrás</w:t>
+      </w:r>
+      <w:r>
+        <w:rPr>
+          <w:rFonts w:ascii="Poppins" w:hAnsi="Poppins" w:cs="Poppins"/>
+          <w:color w:val="00B050"/>
+        </w:rPr>
+        <w:t>:</w:t>
+      </w:r>
+      <w:r>
+        <w:rPr>
+          <w:rFonts w:ascii="Poppins" w:hAnsi="Poppins" w:cs="Poppins"/>
+          <w:color w:val="00B050"/>
+        </w:rPr>
+        <w:br/>
+      </w:r>
+      <w:r>
+        <w:rPr>
+          <w:rFonts w:ascii="Poppins" w:hAnsi="Poppins" w:cs="Poppins"/>
+          <w:color w:val="00B050"/>
+        </w:rPr>
+        <w:br/>
+      </w:r>
+      <w:r>
+        <w:rPr>
+          <w:rFonts w:ascii="Poppins" w:hAnsi="Poppins" w:cs="Poppins"/>
+          <w:color w:val="00B050"/>
+        </w:rPr>
+        <w:t>una comprensión mucho más clara de quién eres, cuáles son los patrones que impulsan o limitan tu crecimiento y qué aspectos de tu vida requieren mayor atención para alcanzar el siguiente nivel de desarrollo.</w:t>
+      </w:r>
+      <w:r>
+        <w:rPr>
+          <w:rFonts w:ascii="Poppins" w:hAnsi="Poppins" w:cs="Poppins"/>
+          <w:color w:val="00B050"/>
+        </w:rPr>
+        <w:br/>
+      </w:r>
+    </w:p>
+    <w:p>
+      <w:pPr>
+        <w:spacing w:after="0"/>
+        <w:jc w:val="both"/>
+        <w:rPr>
+          <w:rFonts w:ascii="Poppins" w:hAnsi="Poppins" w:cs="Poppins"/>
+          <w:color w:val="00B050"/>
+        </w:rPr>
+      </w:pPr>
+      <w:r>
+        <w:rPr>
+          <w:rFonts w:ascii="Poppins" w:hAnsi="Poppins" w:cs="Poppins"/>
+          <w:color w:val="00B050"/>
         </w:rPr>
         <w:t>Contarás con una hoja de ruta personal y profesional que te permitirá tomar decisiones con mayor intención, enfocar tu energía en lo que realmente importa y avanzar con una dirección más clara durante los próximos años.</w:t>
       </w:r>
@@ -2331,20 +2376,23 @@
         <w:jc w:val="both"/>
         <w:rPr>
           <w:rFonts w:ascii="Poppins" w:hAnsi="Poppins" w:cs="Poppins"/>
-        </w:rPr>
-      </w:pPr>
-    </w:p>
-    <w:p>
-      <w:pPr>
-        <w:spacing w:after="0"/>
-        <w:jc w:val="both"/>
-        <w:rPr>
-          <w:rFonts w:ascii="Poppins" w:hAnsi="Poppins" w:cs="Poppins"/>
-        </w:rPr>
-      </w:pPr>
-      <w:r>
-        <w:rPr>
-          <w:rFonts w:ascii="Poppins" w:hAnsi="Poppins" w:cs="Poppins"/>
+          <w:color w:val="00B050"/>
+        </w:rPr>
+      </w:pPr>
+    </w:p>
+    <w:p>
+      <w:pPr>
+        <w:spacing w:after="0"/>
+        <w:jc w:val="both"/>
+        <w:rPr>
+          <w:rFonts w:ascii="Poppins" w:hAnsi="Poppins" w:cs="Poppins"/>
+          <w:color w:val="00B050"/>
+        </w:rPr>
+      </w:pPr>
+      <w:r>
+        <w:rPr>
+          <w:rFonts w:ascii="Poppins" w:hAnsi="Poppins" w:cs="Poppins"/>
+          <w:color w:val="00B050"/>
         </w:rPr>
         <w:t>Habrás fortalecido tu capacidad para liderar, comunicarte, relacionarte y generar impacto de una forma más consciente y coherente con la persona que deseas llegar a ser.</w:t>
       </w:r>
@@ -2355,21 +2403,25 @@
         <w:jc w:val="both"/>
         <w:rPr>
           <w:rFonts w:ascii="Poppins" w:hAnsi="Poppins" w:cs="Poppins"/>
-        </w:rPr>
-      </w:pPr>
-    </w:p>
-    <w:p>
-      <w:pPr>
-        <w:spacing w:after="0"/>
-        <w:jc w:val="both"/>
-        <w:rPr>
-          <w:rFonts w:ascii="Poppins" w:hAnsi="Poppins" w:cs="Poppins"/>
-        </w:rPr>
-      </w:pPr>
-      <w:r>
-        <w:rPr>
-          <w:rFonts w:ascii="Poppins" w:hAnsi="Poppins" w:cs="Poppins"/>
-        </w:rPr>
+          <w:color w:val="00B050"/>
+        </w:rPr>
+      </w:pPr>
+    </w:p>
+    <w:p>
+      <w:pPr>
+        <w:spacing w:after="0"/>
+        <w:jc w:val="both"/>
+        <w:rPr>
+          <w:rFonts w:ascii="Poppins" w:hAnsi="Poppins" w:cs="Poppins"/>
+          <w:color w:val="00B050"/>
+        </w:rPr>
+      </w:pPr>
+      <w:r>
+        <w:rPr>
+          <w:rFonts w:ascii="Poppins" w:hAnsi="Poppins" w:cs="Poppins"/>
+          <w:color w:val="00B050"/>
+        </w:rPr>
+        <w:lastRenderedPageBreak/>
         <w:t>Tendrás herramientas prácticas para continuar desarrollando tu cuerpo, tu mente, tus emociones, tus relaciones y tu liderazgo mucho después de haber terminado el programa.</w:t>
       </w:r>
     </w:p>
@@ -2379,13 +2431,24 @@
         <w:jc w:val="both"/>
         <w:rPr>
           <w:rFonts w:ascii="Poppins" w:hAnsi="Poppins" w:cs="Poppins"/>
-        </w:rPr>
-      </w:pPr>
-      <w:r>
-        <w:rPr>
-          <w:rFonts w:ascii="Poppins" w:hAnsi="Poppins" w:cs="Poppins"/>
-        </w:rPr>
-        <w:lastRenderedPageBreak/>
+          <w:color w:val="00B050"/>
+        </w:rPr>
+      </w:pPr>
+    </w:p>
+    <w:p>
+      <w:pPr>
+        <w:spacing w:after="0"/>
+        <w:jc w:val="both"/>
+        <w:rPr>
+          <w:rFonts w:ascii="Poppins" w:hAnsi="Poppins" w:cs="Poppins"/>
+          <w:color w:val="00B050"/>
+        </w:rPr>
+      </w:pPr>
+      <w:r>
+        <w:rPr>
+          <w:rFonts w:ascii="Poppins" w:hAnsi="Poppins" w:cs="Poppins"/>
+          <w:color w:val="00B050"/>
+        </w:rPr>
         <w:t>Formarás parte de una comunidad de personas comprometidas con su crecimiento, con quienes podrás compartir aprendizajes, desafíos y experiencias a lo largo del camino.</w:t>
       </w:r>
     </w:p>
@@ -2395,20 +2458,23 @@
         <w:jc w:val="both"/>
         <w:rPr>
           <w:rFonts w:ascii="Poppins" w:hAnsi="Poppins" w:cs="Poppins"/>
-        </w:rPr>
-      </w:pPr>
-    </w:p>
-    <w:p>
-      <w:pPr>
-        <w:spacing w:after="0"/>
-        <w:jc w:val="both"/>
-        <w:rPr>
-          <w:rFonts w:ascii="Poppins" w:hAnsi="Poppins" w:cs="Poppins"/>
-        </w:rPr>
-      </w:pPr>
-      <w:r>
-        <w:rPr>
-          <w:rFonts w:ascii="Poppins" w:hAnsi="Poppins" w:cs="Poppins"/>
+          <w:color w:val="00B050"/>
+        </w:rPr>
+      </w:pPr>
+    </w:p>
+    <w:p>
+      <w:pPr>
+        <w:spacing w:after="0"/>
+        <w:jc w:val="both"/>
+        <w:rPr>
+          <w:rFonts w:ascii="Poppins" w:hAnsi="Poppins" w:cs="Poppins"/>
+          <w:color w:val="00B050"/>
+        </w:rPr>
+      </w:pPr>
+      <w:r>
+        <w:rPr>
+          <w:rFonts w:ascii="Poppins" w:hAnsi="Poppins" w:cs="Poppins"/>
+          <w:color w:val="00B050"/>
         </w:rPr>
         <w:t>Pero quizás el resultado más importante no sea algo que puedas medir fácilmente.</w:t>
       </w:r>
@@ -2419,11 +2485,13 @@
         <w:jc w:val="both"/>
         <w:rPr>
           <w:rFonts w:ascii="Poppins" w:hAnsi="Poppins" w:cs="Poppins"/>
-        </w:rPr>
-      </w:pPr>
-      <w:r>
-        <w:rPr>
-          <w:rFonts w:ascii="Poppins" w:hAnsi="Poppins" w:cs="Poppins"/>
+          <w:color w:val="00B050"/>
+        </w:rPr>
+      </w:pPr>
+      <w:r>
+        <w:rPr>
+          <w:rFonts w:ascii="Poppins" w:hAnsi="Poppins" w:cs="Poppins"/>
+          <w:color w:val="00B050"/>
         </w:rPr>
         <w:t>Es la tranquilidad que surge cuando existe una mayor coherencia entre lo que piensas, lo que sientes, lo que haces y la vida que realmente quieres construir.</w:t>
       </w:r>
@@ -2445,6 +2513,7 @@
           <w:rFonts w:ascii="Poppins" w:hAnsi="Poppins" w:cs="Poppins"/>
           <w:b/>
           <w:bCs/>
+          <w:color w:val="00B050"/>
         </w:rPr>
       </w:pPr>
       <w:r>
@@ -2452,6 +2521,7 @@
           <w:rFonts w:ascii="Poppins" w:hAnsi="Poppins" w:cs="Poppins"/>
           <w:b/>
           <w:bCs/>
+          <w:color w:val="00B050"/>
         </w:rPr>
         <w:t>¿Cómo vivirás la experiencia?</w:t>
       </w:r>
@@ -2462,20 +2532,23 @@
         <w:jc w:val="both"/>
         <w:rPr>
           <w:rFonts w:ascii="Poppins" w:hAnsi="Poppins" w:cs="Poppins"/>
-        </w:rPr>
-      </w:pPr>
-    </w:p>
-    <w:p>
-      <w:pPr>
-        <w:spacing w:after="0"/>
-        <w:jc w:val="both"/>
-        <w:rPr>
-          <w:rFonts w:ascii="Poppins" w:hAnsi="Poppins" w:cs="Poppins"/>
-        </w:rPr>
-      </w:pPr>
-      <w:r>
-        <w:rPr>
-          <w:rFonts w:ascii="Poppins" w:hAnsi="Poppins" w:cs="Poppins"/>
+          <w:color w:val="00B050"/>
+        </w:rPr>
+      </w:pPr>
+    </w:p>
+    <w:p>
+      <w:pPr>
+        <w:spacing w:after="0"/>
+        <w:jc w:val="both"/>
+        <w:rPr>
+          <w:rFonts w:ascii="Poppins" w:hAnsi="Poppins" w:cs="Poppins"/>
+          <w:color w:val="00B050"/>
+        </w:rPr>
+      </w:pPr>
+      <w:r>
+        <w:rPr>
+          <w:rFonts w:ascii="Poppins" w:hAnsi="Poppins" w:cs="Poppins"/>
+          <w:color w:val="00B050"/>
         </w:rPr>
         <w:t>Master Live Training ha sido diseñado para que el desarrollo no se quede en una buena conversación, una reflexión inspiradora o una idea interesante. Nuestro propósito es ayudarte a transformar el conocimiento en consciencia, la consciencia en acción y la acción en resultados sostenibles.</w:t>
       </w:r>
@@ -2486,20 +2559,23 @@
         <w:jc w:val="both"/>
         <w:rPr>
           <w:rFonts w:ascii="Poppins" w:hAnsi="Poppins" w:cs="Poppins"/>
-        </w:rPr>
-      </w:pPr>
-    </w:p>
-    <w:p>
-      <w:pPr>
-        <w:spacing w:after="0"/>
-        <w:jc w:val="both"/>
-        <w:rPr>
-          <w:rFonts w:ascii="Poppins" w:hAnsi="Poppins" w:cs="Poppins"/>
-        </w:rPr>
-      </w:pPr>
-      <w:r>
-        <w:rPr>
-          <w:rFonts w:ascii="Poppins" w:hAnsi="Poppins" w:cs="Poppins"/>
+          <w:color w:val="00B050"/>
+        </w:rPr>
+      </w:pPr>
+    </w:p>
+    <w:p>
+      <w:pPr>
+        <w:spacing w:after="0"/>
+        <w:jc w:val="both"/>
+        <w:rPr>
+          <w:rFonts w:ascii="Poppins" w:hAnsi="Poppins" w:cs="Poppins"/>
+          <w:color w:val="00B050"/>
+        </w:rPr>
+      </w:pPr>
+      <w:r>
+        <w:rPr>
+          <w:rFonts w:ascii="Poppins" w:hAnsi="Poppins" w:cs="Poppins"/>
+          <w:color w:val="00B050"/>
         </w:rPr>
         <w:t>Durante 90 días recorrerás un proceso estructurado de entrenamiento integral que combina aprendizaje, reflexión, práctica, acompañamiento y comunidad.</w:t>
       </w:r>
@@ -2510,20 +2586,23 @@
         <w:jc w:val="both"/>
         <w:rPr>
           <w:rFonts w:ascii="Poppins" w:hAnsi="Poppins" w:cs="Poppins"/>
-        </w:rPr>
-      </w:pPr>
-    </w:p>
-    <w:p>
-      <w:pPr>
-        <w:spacing w:after="0"/>
-        <w:jc w:val="both"/>
-        <w:rPr>
-          <w:rFonts w:ascii="Poppins" w:hAnsi="Poppins" w:cs="Poppins"/>
-        </w:rPr>
-      </w:pPr>
-      <w:r>
-        <w:rPr>
-          <w:rFonts w:ascii="Poppins" w:hAnsi="Poppins" w:cs="Poppins"/>
+          <w:color w:val="00B050"/>
+        </w:rPr>
+      </w:pPr>
+    </w:p>
+    <w:p>
+      <w:pPr>
+        <w:spacing w:after="0"/>
+        <w:jc w:val="both"/>
+        <w:rPr>
+          <w:rFonts w:ascii="Poppins" w:hAnsi="Poppins" w:cs="Poppins"/>
+          <w:color w:val="00B050"/>
+        </w:rPr>
+      </w:pPr>
+      <w:r>
+        <w:rPr>
+          <w:rFonts w:ascii="Poppins" w:hAnsi="Poppins" w:cs="Poppins"/>
+          <w:color w:val="00B050"/>
         </w:rPr>
         <w:t>A lo largo de este recorrido participarás en:</w:t>
       </w:r>
@@ -2534,26 +2613,30 @@
         <w:jc w:val="both"/>
         <w:rPr>
           <w:rFonts w:ascii="Segoe UI Symbol" w:hAnsi="Segoe UI Symbol" w:cs="Segoe UI Symbol"/>
-        </w:rPr>
-      </w:pPr>
-    </w:p>
-    <w:p>
-      <w:pPr>
-        <w:spacing w:after="0"/>
-        <w:jc w:val="both"/>
-        <w:rPr>
-          <w:rFonts w:ascii="Poppins" w:hAnsi="Poppins" w:cs="Poppins"/>
+          <w:color w:val="00B050"/>
+        </w:rPr>
+      </w:pPr>
+    </w:p>
+    <w:p>
+      <w:pPr>
+        <w:spacing w:after="0"/>
+        <w:jc w:val="both"/>
+        <w:rPr>
+          <w:rFonts w:ascii="Poppins" w:hAnsi="Poppins" w:cs="Poppins"/>
+          <w:color w:val="00B050"/>
         </w:rPr>
       </w:pPr>
       <w:r>
         <w:rPr>
           <w:rFonts w:ascii="Segoe UI Symbol" w:hAnsi="Segoe UI Symbol" w:cs="Segoe UI Symbol"/>
+          <w:color w:val="00B050"/>
         </w:rPr>
         <w:t>✓</w:t>
       </w:r>
       <w:r>
         <w:rPr>
           <w:rFonts w:ascii="Poppins" w:hAnsi="Poppins" w:cs="Poppins"/>
+          <w:color w:val="00B050"/>
         </w:rPr>
         <w:t xml:space="preserve"> 5 experiencias inmersivas diseñadas para profundizar en las dimensiones fundamentales del desarrollo humano.</w:t>
       </w:r>
@@ -2564,17 +2647,20 @@
         <w:jc w:val="both"/>
         <w:rPr>
           <w:rFonts w:ascii="Poppins" w:hAnsi="Poppins" w:cs="Poppins"/>
+          <w:color w:val="00B050"/>
         </w:rPr>
       </w:pPr>
       <w:r>
         <w:rPr>
           <w:rFonts w:ascii="Segoe UI Symbol" w:hAnsi="Segoe UI Symbol" w:cs="Segoe UI Symbol"/>
+          <w:color w:val="00B050"/>
         </w:rPr>
         <w:t>✓</w:t>
       </w:r>
       <w:r>
         <w:rPr>
           <w:rFonts w:ascii="Poppins" w:hAnsi="Poppins" w:cs="Poppins"/>
+          <w:color w:val="00B050"/>
         </w:rPr>
         <w:t xml:space="preserve"> 6 conversatorios en vivo para reflexionar, compartir aprendizajes y resolver inquietudes junto a otros participantes.</w:t>
       </w:r>
@@ -2585,17 +2671,20 @@
         <w:jc w:val="both"/>
         <w:rPr>
           <w:rFonts w:ascii="Poppins" w:hAnsi="Poppins" w:cs="Poppins"/>
+          <w:color w:val="00B050"/>
         </w:rPr>
       </w:pPr>
       <w:r>
         <w:rPr>
           <w:rFonts w:ascii="Segoe UI Symbol" w:hAnsi="Segoe UI Symbol" w:cs="Segoe UI Symbol"/>
+          <w:color w:val="00B050"/>
         </w:rPr>
         <w:t>✓</w:t>
       </w:r>
       <w:r>
         <w:rPr>
           <w:rFonts w:ascii="Poppins" w:hAnsi="Poppins" w:cs="Poppins"/>
+          <w:color w:val="00B050"/>
         </w:rPr>
         <w:t xml:space="preserve"> Contenidos y recursos prácticos que te permitirán continuar trabajando entre cada encuentro.</w:t>
       </w:r>
@@ -2606,17 +2695,20 @@
         <w:jc w:val="both"/>
         <w:rPr>
           <w:rFonts w:ascii="Poppins" w:hAnsi="Poppins" w:cs="Poppins"/>
+          <w:color w:val="00B050"/>
         </w:rPr>
       </w:pPr>
       <w:r>
         <w:rPr>
           <w:rFonts w:ascii="Segoe UI Symbol" w:hAnsi="Segoe UI Symbol" w:cs="Segoe UI Symbol"/>
+          <w:color w:val="00B050"/>
         </w:rPr>
         <w:t>✓</w:t>
       </w:r>
       <w:r>
         <w:rPr>
           <w:rFonts w:ascii="Poppins" w:hAnsi="Poppins" w:cs="Poppins"/>
+          <w:color w:val="00B050"/>
         </w:rPr>
         <w:t xml:space="preserve"> Ejercicios de aplicación personal y profesional para llevar cada aprendizaje a tu realidad cotidiana.</w:t>
       </w:r>
@@ -2627,17 +2719,20 @@
         <w:jc w:val="both"/>
         <w:rPr>
           <w:rFonts w:ascii="Poppins" w:hAnsi="Poppins" w:cs="Poppins"/>
+          <w:color w:val="00B050"/>
         </w:rPr>
       </w:pPr>
       <w:r>
         <w:rPr>
           <w:rFonts w:ascii="Segoe UI Symbol" w:hAnsi="Segoe UI Symbol" w:cs="Segoe UI Symbol"/>
+          <w:color w:val="00B050"/>
         </w:rPr>
         <w:t>✓</w:t>
       </w:r>
       <w:r>
         <w:rPr>
           <w:rFonts w:ascii="Poppins" w:hAnsi="Poppins" w:cs="Poppins"/>
+          <w:color w:val="00B050"/>
         </w:rPr>
         <w:t xml:space="preserve"> Una comunidad exclusiva de líderes y empresarios comprometidos con su crecimiento y evolución.</w:t>
       </w:r>
@@ -2648,17 +2743,21 @@
         <w:jc w:val="both"/>
         <w:rPr>
           <w:rFonts w:ascii="Poppins" w:hAnsi="Poppins" w:cs="Poppins"/>
+          <w:color w:val="00B050"/>
         </w:rPr>
       </w:pPr>
       <w:r>
         <w:rPr>
           <w:rFonts w:ascii="Segoe UI Symbol" w:hAnsi="Segoe UI Symbol" w:cs="Segoe UI Symbol"/>
-        </w:rPr>
+          <w:color w:val="00B050"/>
+        </w:rPr>
+        <w:lastRenderedPageBreak/>
         <w:t>✓</w:t>
       </w:r>
       <w:r>
         <w:rPr>
           <w:rFonts w:ascii="Poppins" w:hAnsi="Poppins" w:cs="Poppins"/>
+          <w:color w:val="00B050"/>
         </w:rPr>
         <w:t xml:space="preserve"> Acompañamiento permanente durante todo el proceso.</w:t>
       </w:r>
@@ -2669,11 +2768,13 @@
         <w:jc w:val="both"/>
         <w:rPr>
           <w:rFonts w:ascii="Poppins" w:hAnsi="Poppins" w:cs="Poppins"/>
-        </w:rPr>
-      </w:pPr>
-      <w:r>
-        <w:rPr>
-          <w:rFonts w:ascii="Poppins" w:hAnsi="Poppins" w:cs="Poppins"/>
+          <w:color w:val="00B050"/>
+        </w:rPr>
+      </w:pPr>
+      <w:r>
+        <w:rPr>
+          <w:rFonts w:ascii="Poppins" w:hAnsi="Poppins" w:cs="Poppins"/>
+          <w:color w:val="00B050"/>
         </w:rPr>
         <w:t>La experiencia ha sido diseñada para generar un equilibrio entre reflexión y acción, entre desarrollo personal y aplicación práctica, entre crecimiento individual y aprendizaje colectivo.</w:t>
       </w:r>
@@ -2684,6 +2785,232 @@
         <w:jc w:val="both"/>
         <w:rPr>
           <w:rFonts w:ascii="Poppins" w:hAnsi="Poppins" w:cs="Poppins"/>
+          <w:color w:val="00B050"/>
+        </w:rPr>
+      </w:pPr>
+      <w:r>
+        <w:rPr>
+          <w:rFonts w:ascii="Poppins" w:hAnsi="Poppins" w:cs="Poppins"/>
+          <w:color w:val="00B050"/>
+        </w:rPr>
+        <w:t>No se trata únicamente de comprender nuevas ideas.</w:t>
+      </w:r>
+      <w:r>
+        <w:rPr>
+          <w:rFonts w:ascii="Poppins" w:hAnsi="Poppins" w:cs="Poppins"/>
+          <w:color w:val="00B050"/>
+        </w:rPr>
+        <w:t xml:space="preserve"> </w:t>
+      </w:r>
+      <w:r>
+        <w:rPr>
+          <w:rFonts w:ascii="Poppins" w:hAnsi="Poppins" w:cs="Poppins"/>
+          <w:color w:val="00B050"/>
+        </w:rPr>
+        <w:t>Se trata de vivirlas, ponerlas en práctica y convertirlas en parte de la persona que estás llegando a ser.</w:t>
+      </w:r>
+    </w:p>
+    <w:p>
+      <w:pPr>
+        <w:spacing w:after="0"/>
+        <w:jc w:val="both"/>
+        <w:rPr>
+          <w:rFonts w:ascii="Poppins" w:hAnsi="Poppins" w:cs="Poppins"/>
+        </w:rPr>
+      </w:pPr>
+    </w:p>
+    <w:p>
+      <w:pPr>
+        <w:spacing w:after="0"/>
+        <w:jc w:val="both"/>
+        <w:rPr>
+          <w:rFonts w:ascii="Poppins" w:hAnsi="Poppins" w:cs="Poppins"/>
+        </w:rPr>
+      </w:pPr>
+      <w:r>
+        <w:rPr>
+          <w:rFonts w:ascii="Poppins" w:hAnsi="Poppins" w:cs="Poppins"/>
+        </w:rPr>
+        <w:t>A</w:t>
+      </w:r>
+      <w:r>
+        <w:rPr>
+          <w:rFonts w:ascii="Poppins" w:hAnsi="Poppins" w:cs="Poppins"/>
+        </w:rPr>
+        <w:t>unque</w:t>
+      </w:r>
+      <w:r>
+        <w:rPr>
+          <w:rFonts w:ascii="Poppins" w:hAnsi="Poppins" w:cs="Poppins"/>
+        </w:rPr>
+        <w:t xml:space="preserve"> el entrenamiento tiene una duración de 90 días, el camino no termina allí.</w:t>
+      </w:r>
+    </w:p>
+    <w:p>
+      <w:pPr>
+        <w:spacing w:after="0"/>
+        <w:jc w:val="both"/>
+        <w:rPr>
+          <w:rFonts w:ascii="Poppins" w:hAnsi="Poppins" w:cs="Poppins"/>
+        </w:rPr>
+      </w:pPr>
+      <w:r>
+        <w:rPr>
+          <w:rFonts w:ascii="Poppins" w:hAnsi="Poppins" w:cs="Poppins"/>
+        </w:rPr>
+        <w:t>Quienes lo deseen podrán continuar profundizando en su proceso de desarrollo a través de nuevas experiencias, espacios de acompañamiento y una comunidad comprometida con el crecimiento consciente.</w:t>
+      </w:r>
+    </w:p>
+    <w:p>
+      <w:pPr>
+        <w:spacing w:after="0"/>
+        <w:jc w:val="both"/>
+        <w:rPr>
+          <w:rFonts w:ascii="Poppins" w:hAnsi="Poppins" w:cs="Poppins"/>
+        </w:rPr>
+      </w:pPr>
+    </w:p>
+    <w:p>
+      <w:pPr>
+        <w:spacing w:after="0"/>
+        <w:jc w:val="both"/>
+        <w:rPr>
+          <w:rFonts w:ascii="Poppins" w:hAnsi="Poppins" w:cs="Poppins"/>
+        </w:rPr>
+      </w:pPr>
+      <w:r>
+        <w:rPr>
+          <w:rFonts w:ascii="Poppins" w:hAnsi="Poppins" w:cs="Poppins"/>
+        </w:rPr>
+        <w:t>Lo que te llevarás al finalizar esta experiencia</w:t>
+      </w:r>
+    </w:p>
+    <w:p>
+      <w:pPr>
+        <w:spacing w:after="0"/>
+        <w:jc w:val="both"/>
+        <w:rPr>
+          <w:rFonts w:ascii="Poppins" w:hAnsi="Poppins" w:cs="Poppins"/>
+        </w:rPr>
+      </w:pPr>
+      <w:r>
+        <w:rPr>
+          <w:rFonts w:ascii="Poppins" w:hAnsi="Poppins" w:cs="Poppins"/>
+        </w:rPr>
+        <w:t>Aunque cada persona vive el proceso de manera diferente, existen resultados que suelen repetirse una y otra vez en quienes recorren este camino con compromiso y apertura.</w:t>
+      </w:r>
+    </w:p>
+    <w:p>
+      <w:pPr>
+        <w:spacing w:after="0"/>
+        <w:jc w:val="both"/>
+        <w:rPr>
+          <w:rFonts w:ascii="Poppins" w:hAnsi="Poppins" w:cs="Poppins"/>
+        </w:rPr>
+      </w:pPr>
+    </w:p>
+    <w:p>
+      <w:pPr>
+        <w:spacing w:after="0"/>
+        <w:jc w:val="both"/>
+        <w:rPr>
+          <w:rFonts w:ascii="Poppins" w:hAnsi="Poppins" w:cs="Poppins"/>
+        </w:rPr>
+      </w:pPr>
+      <w:r>
+        <w:rPr>
+          <w:rFonts w:ascii="Poppins" w:hAnsi="Poppins" w:cs="Poppins"/>
+        </w:rPr>
+        <w:t>Tendrás una comprensión mucho más clara de quién eres, qué te impulsa, cuáles son los patrones que favorecen tu crecimiento y cuáles son aquellos que hoy limitan tu desarrollo.</w:t>
+      </w:r>
+    </w:p>
+    <w:p>
+      <w:pPr>
+        <w:spacing w:after="0"/>
+        <w:jc w:val="both"/>
+        <w:rPr>
+          <w:rFonts w:ascii="Poppins" w:hAnsi="Poppins" w:cs="Poppins"/>
+        </w:rPr>
+      </w:pPr>
+    </w:p>
+    <w:p>
+      <w:pPr>
+        <w:spacing w:after="0"/>
+        <w:jc w:val="both"/>
+        <w:rPr>
+          <w:rFonts w:ascii="Poppins" w:hAnsi="Poppins" w:cs="Poppins"/>
+        </w:rPr>
+      </w:pPr>
+      <w:r>
+        <w:rPr>
+          <w:rFonts w:ascii="Poppins" w:hAnsi="Poppins" w:cs="Poppins"/>
+        </w:rPr>
+        <w:t>Contarás con una hoja de ruta personal y profesional que te permitirá tomar decisiones con mayor claridad, enfocar tu energía en lo que realmente importa y avanzar con una dirección más consciente durante los próximos años.</w:t>
+      </w:r>
+    </w:p>
+    <w:p>
+      <w:pPr>
+        <w:spacing w:after="0"/>
+        <w:jc w:val="both"/>
+        <w:rPr>
+          <w:rFonts w:ascii="Poppins" w:hAnsi="Poppins" w:cs="Poppins"/>
+        </w:rPr>
+      </w:pPr>
+    </w:p>
+    <w:p>
+      <w:pPr>
+        <w:spacing w:after="0"/>
+        <w:jc w:val="both"/>
+        <w:rPr>
+          <w:rFonts w:ascii="Poppins" w:hAnsi="Poppins" w:cs="Poppins"/>
+        </w:rPr>
+      </w:pPr>
+      <w:r>
+        <w:rPr>
+          <w:rFonts w:ascii="Poppins" w:hAnsi="Poppins" w:cs="Poppins"/>
+        </w:rPr>
+        <w:t>Habrás fortalecido tu capacidad para liderar, comunicarte, relacionarte y generar impacto de una forma más coherente con la persona que deseas llegar a ser.</w:t>
+      </w:r>
+    </w:p>
+    <w:p>
+      <w:pPr>
+        <w:spacing w:after="0"/>
+        <w:jc w:val="both"/>
+        <w:rPr>
+          <w:rFonts w:ascii="Poppins" w:hAnsi="Poppins" w:cs="Poppins"/>
+        </w:rPr>
+      </w:pPr>
+    </w:p>
+    <w:p>
+      <w:pPr>
+        <w:spacing w:after="0"/>
+        <w:jc w:val="both"/>
+        <w:rPr>
+          <w:rFonts w:ascii="Poppins" w:hAnsi="Poppins" w:cs="Poppins"/>
+        </w:rPr>
+      </w:pPr>
+      <w:r>
+        <w:rPr>
+          <w:rFonts w:ascii="Poppins" w:hAnsi="Poppins" w:cs="Poppins"/>
+        </w:rPr>
+        <w:t>Dispondrás de herramientas prácticas para continuar desarrollando tu cuerpo, tu mente, tus emociones, tus relaciones y tu liderazgo mucho después de haber terminado el programa.</w:t>
+      </w:r>
+    </w:p>
+    <w:p>
+      <w:pPr>
+        <w:spacing w:after="0"/>
+        <w:jc w:val="both"/>
+        <w:rPr>
+          <w:rFonts w:ascii="Poppins" w:hAnsi="Poppins" w:cs="Poppins"/>
+        </w:rPr>
+      </w:pPr>
+    </w:p>
+    <w:p>
+      <w:pPr>
+        <w:spacing w:after="0"/>
+        <w:jc w:val="both"/>
+        <w:rPr>
+          <w:rFonts w:ascii="Poppins" w:hAnsi="Poppins" w:cs="Poppins"/>
         </w:rPr>
       </w:pPr>
       <w:r>
@@ -2691,228 +3018,6 @@
           <w:rFonts w:ascii="Poppins" w:hAnsi="Poppins" w:cs="Poppins"/>
         </w:rPr>
         <w:lastRenderedPageBreak/>
-        <w:t>No se trata únicamente de comprender nuevas ideas.</w:t>
-      </w:r>
-      <w:r>
-        <w:rPr>
-          <w:rFonts w:ascii="Poppins" w:hAnsi="Poppins" w:cs="Poppins"/>
-        </w:rPr>
-        <w:t xml:space="preserve"> </w:t>
-      </w:r>
-      <w:r>
-        <w:rPr>
-          <w:rFonts w:ascii="Poppins" w:hAnsi="Poppins" w:cs="Poppins"/>
-        </w:rPr>
-        <w:t>Se trata de vivirlas, ponerlas en práctica y convertirlas en parte de la persona que estás llegando a ser.</w:t>
-      </w:r>
-    </w:p>
-    <w:p>
-      <w:pPr>
-        <w:spacing w:after="0"/>
-        <w:jc w:val="both"/>
-        <w:rPr>
-          <w:rFonts w:ascii="Poppins" w:hAnsi="Poppins" w:cs="Poppins"/>
-        </w:rPr>
-      </w:pPr>
-    </w:p>
-    <w:p>
-      <w:pPr>
-        <w:spacing w:after="0"/>
-        <w:jc w:val="both"/>
-        <w:rPr>
-          <w:rFonts w:ascii="Poppins" w:hAnsi="Poppins" w:cs="Poppins"/>
-        </w:rPr>
-      </w:pPr>
-      <w:r>
-        <w:rPr>
-          <w:rFonts w:ascii="Poppins" w:hAnsi="Poppins" w:cs="Poppins"/>
-        </w:rPr>
-        <w:t>A</w:t>
-      </w:r>
-      <w:r>
-        <w:rPr>
-          <w:rFonts w:ascii="Poppins" w:hAnsi="Poppins" w:cs="Poppins"/>
-        </w:rPr>
-        <w:t>unque</w:t>
-      </w:r>
-      <w:r>
-        <w:rPr>
-          <w:rFonts w:ascii="Poppins" w:hAnsi="Poppins" w:cs="Poppins"/>
-        </w:rPr>
-        <w:t xml:space="preserve"> el entrenamiento tiene una duración de 90 días, el camino no termina allí.</w:t>
-      </w:r>
-    </w:p>
-    <w:p>
-      <w:pPr>
-        <w:spacing w:after="0"/>
-        <w:jc w:val="both"/>
-        <w:rPr>
-          <w:rFonts w:ascii="Poppins" w:hAnsi="Poppins" w:cs="Poppins"/>
-        </w:rPr>
-      </w:pPr>
-      <w:r>
-        <w:rPr>
-          <w:rFonts w:ascii="Poppins" w:hAnsi="Poppins" w:cs="Poppins"/>
-        </w:rPr>
-        <w:t>Quienes lo deseen podrán continuar profundizando en su proceso de desarrollo a través de nuevas experiencias, espacios de acompañamiento y una comunidad comprometida con el crecimiento consciente.</w:t>
-      </w:r>
-    </w:p>
-    <w:p>
-      <w:pPr>
-        <w:spacing w:after="0"/>
-        <w:jc w:val="both"/>
-        <w:rPr>
-          <w:rFonts w:ascii="Poppins" w:hAnsi="Poppins" w:cs="Poppins"/>
-        </w:rPr>
-      </w:pPr>
-    </w:p>
-    <w:p>
-      <w:pPr>
-        <w:spacing w:after="0"/>
-        <w:jc w:val="both"/>
-        <w:rPr>
-          <w:rFonts w:ascii="Poppins" w:hAnsi="Poppins" w:cs="Poppins"/>
-        </w:rPr>
-      </w:pPr>
-      <w:r>
-        <w:rPr>
-          <w:rFonts w:ascii="Poppins" w:hAnsi="Poppins" w:cs="Poppins"/>
-        </w:rPr>
-        <w:t>Lo que te llevarás al finalizar esta experiencia</w:t>
-      </w:r>
-    </w:p>
-    <w:p>
-      <w:pPr>
-        <w:spacing w:after="0"/>
-        <w:jc w:val="both"/>
-        <w:rPr>
-          <w:rFonts w:ascii="Poppins" w:hAnsi="Poppins" w:cs="Poppins"/>
-        </w:rPr>
-      </w:pPr>
-      <w:r>
-        <w:rPr>
-          <w:rFonts w:ascii="Poppins" w:hAnsi="Poppins" w:cs="Poppins"/>
-        </w:rPr>
-        <w:t>Aunque cada persona vive el proceso de manera diferente, existen resultados que suelen repetirse una y otra vez en quienes recorren este camino con compromiso y apertura.</w:t>
-      </w:r>
-    </w:p>
-    <w:p>
-      <w:pPr>
-        <w:spacing w:after="0"/>
-        <w:jc w:val="both"/>
-        <w:rPr>
-          <w:rFonts w:ascii="Poppins" w:hAnsi="Poppins" w:cs="Poppins"/>
-        </w:rPr>
-      </w:pPr>
-    </w:p>
-    <w:p>
-      <w:pPr>
-        <w:spacing w:after="0"/>
-        <w:jc w:val="both"/>
-        <w:rPr>
-          <w:rFonts w:ascii="Poppins" w:hAnsi="Poppins" w:cs="Poppins"/>
-        </w:rPr>
-      </w:pPr>
-      <w:r>
-        <w:rPr>
-          <w:rFonts w:ascii="Poppins" w:hAnsi="Poppins" w:cs="Poppins"/>
-        </w:rPr>
-        <w:t>Tendrás una comprensión mucho más clara de quién eres, qué te impulsa, cuáles son los patrones que favorecen tu crecimiento y cuáles son aquellos que hoy limitan tu desarrollo.</w:t>
-      </w:r>
-    </w:p>
-    <w:p>
-      <w:pPr>
-        <w:spacing w:after="0"/>
-        <w:jc w:val="both"/>
-        <w:rPr>
-          <w:rFonts w:ascii="Poppins" w:hAnsi="Poppins" w:cs="Poppins"/>
-        </w:rPr>
-      </w:pPr>
-    </w:p>
-    <w:p>
-      <w:pPr>
-        <w:spacing w:after="0"/>
-        <w:jc w:val="both"/>
-        <w:rPr>
-          <w:rFonts w:ascii="Poppins" w:hAnsi="Poppins" w:cs="Poppins"/>
-        </w:rPr>
-      </w:pPr>
-      <w:r>
-        <w:rPr>
-          <w:rFonts w:ascii="Poppins" w:hAnsi="Poppins" w:cs="Poppins"/>
-        </w:rPr>
-        <w:t>Contarás con una hoja de ruta personal y profesional que te permitirá tomar decisiones con mayor claridad, enfocar tu energía en lo que realmente importa y avanzar con una dirección más consciente durante los próximos años.</w:t>
-      </w:r>
-    </w:p>
-    <w:p>
-      <w:pPr>
-        <w:spacing w:after="0"/>
-        <w:jc w:val="both"/>
-        <w:rPr>
-          <w:rFonts w:ascii="Poppins" w:hAnsi="Poppins" w:cs="Poppins"/>
-        </w:rPr>
-      </w:pPr>
-    </w:p>
-    <w:p>
-      <w:pPr>
-        <w:spacing w:after="0"/>
-        <w:jc w:val="both"/>
-        <w:rPr>
-          <w:rFonts w:ascii="Poppins" w:hAnsi="Poppins" w:cs="Poppins"/>
-        </w:rPr>
-      </w:pPr>
-      <w:r>
-        <w:rPr>
-          <w:rFonts w:ascii="Poppins" w:hAnsi="Poppins" w:cs="Poppins"/>
-        </w:rPr>
-        <w:t>Habrás fortalecido tu capacidad para liderar, comunicarte, relacionarte y generar impacto de una forma más coherente con la persona que deseas llegar a ser.</w:t>
-      </w:r>
-    </w:p>
-    <w:p>
-      <w:pPr>
-        <w:spacing w:after="0"/>
-        <w:jc w:val="both"/>
-        <w:rPr>
-          <w:rFonts w:ascii="Poppins" w:hAnsi="Poppins" w:cs="Poppins"/>
-        </w:rPr>
-      </w:pPr>
-    </w:p>
-    <w:p>
-      <w:pPr>
-        <w:spacing w:after="0"/>
-        <w:jc w:val="both"/>
-        <w:rPr>
-          <w:rFonts w:ascii="Poppins" w:hAnsi="Poppins" w:cs="Poppins"/>
-        </w:rPr>
-      </w:pPr>
-      <w:r>
-        <w:rPr>
-          <w:rFonts w:ascii="Poppins" w:hAnsi="Poppins" w:cs="Poppins"/>
-        </w:rPr>
-        <w:t>Dispondrás de herramientas prácticas para continuar desarrollando tu cuerpo, tu mente, tus emociones, tus relaciones y tu liderazgo mucho después de haber terminado el programa.</w:t>
-      </w:r>
-    </w:p>
-    <w:p>
-      <w:pPr>
-        <w:spacing w:after="0"/>
-        <w:jc w:val="both"/>
-        <w:rPr>
-          <w:rFonts w:ascii="Poppins" w:hAnsi="Poppins" w:cs="Poppins"/>
-        </w:rPr>
-      </w:pPr>
-    </w:p>
-    <w:p>
-      <w:pPr>
-        <w:spacing w:after="0"/>
-        <w:jc w:val="both"/>
-        <w:rPr>
-          <w:rFonts w:ascii="Poppins" w:hAnsi="Poppins" w:cs="Poppins"/>
-        </w:rPr>
-      </w:pPr>
-      <w:r>
-        <w:rPr>
-          <w:rFonts w:ascii="Poppins" w:hAnsi="Poppins" w:cs="Poppins"/>
-        </w:rPr>
         <w:t>Formarás parte de una comunidad de personas comprometidas con su crecimiento y evolución, con quienes podrás compartir aprendizajes, desafíos y oportunidades a lo largo del tiempo.</w:t>
       </w:r>
     </w:p>
@@ -2952,7 +3057,6 @@
         <w:rPr>
           <w:rFonts w:ascii="Poppins" w:hAnsi="Poppins" w:cs="Poppins"/>
         </w:rPr>
-        <w:lastRenderedPageBreak/>
         <w:t>La tranquilidad que surge cuando existe una mayor coherencia entre lo que piensas, lo que sientes, lo que haces y la vida que realmente quieres construir.</w:t>
       </w:r>
     </w:p>
@@ -2973,6 +3077,7 @@
           <w:rFonts w:ascii="Poppins" w:hAnsi="Poppins" w:cs="Poppins"/>
           <w:b/>
           <w:bCs/>
+          <w:color w:val="00B050"/>
         </w:rPr>
       </w:pPr>
       <w:r>
@@ -2980,6 +3085,7 @@
           <w:rFonts w:ascii="Poppins" w:hAnsi="Poppins" w:cs="Poppins"/>
           <w:b/>
           <w:bCs/>
+          <w:color w:val="00B050"/>
         </w:rPr>
         <w:t>En 90 días podrás llevarte:</w:t>
       </w:r>
@@ -2992,26 +3098,30 @@
           <w:rFonts w:ascii="Poppins" w:hAnsi="Poppins" w:cs="Poppins"/>
           <w:b/>
           <w:bCs/>
-        </w:rPr>
-      </w:pPr>
-    </w:p>
-    <w:p>
-      <w:pPr>
-        <w:spacing w:after="0"/>
-        <w:jc w:val="both"/>
-        <w:rPr>
-          <w:rFonts w:ascii="Poppins" w:hAnsi="Poppins" w:cs="Poppins"/>
+          <w:color w:val="00B050"/>
+        </w:rPr>
+      </w:pPr>
+    </w:p>
+    <w:p>
+      <w:pPr>
+        <w:spacing w:after="0"/>
+        <w:jc w:val="both"/>
+        <w:rPr>
+          <w:rFonts w:ascii="Poppins" w:hAnsi="Poppins" w:cs="Poppins"/>
+          <w:color w:val="00B050"/>
         </w:rPr>
       </w:pPr>
       <w:r>
         <w:rPr>
           <w:rFonts w:ascii="Segoe UI Symbol" w:hAnsi="Segoe UI Symbol" w:cs="Segoe UI Symbol"/>
+          <w:color w:val="00B050"/>
         </w:rPr>
         <w:t>✓</w:t>
       </w:r>
       <w:r>
         <w:rPr>
           <w:rFonts w:ascii="Poppins" w:hAnsi="Poppins" w:cs="Poppins"/>
+          <w:color w:val="00B050"/>
         </w:rPr>
         <w:t xml:space="preserve"> Mayor claridad sobre quién eres y hacia dónde quieres dirigir tu vida.</w:t>
       </w:r>
@@ -3022,17 +3132,20 @@
         <w:jc w:val="both"/>
         <w:rPr>
           <w:rFonts w:ascii="Poppins" w:hAnsi="Poppins" w:cs="Poppins"/>
+          <w:color w:val="00B050"/>
         </w:rPr>
       </w:pPr>
       <w:r>
         <w:rPr>
           <w:rFonts w:ascii="Segoe UI Symbol" w:hAnsi="Segoe UI Symbol" w:cs="Segoe UI Symbol"/>
+          <w:color w:val="00B050"/>
         </w:rPr>
         <w:t>✓</w:t>
       </w:r>
       <w:r>
         <w:rPr>
           <w:rFonts w:ascii="Poppins" w:hAnsi="Poppins" w:cs="Poppins"/>
+          <w:color w:val="00B050"/>
         </w:rPr>
         <w:t xml:space="preserve"> Identificación de los patrones que limitan tu crecimiento.</w:t>
       </w:r>
@@ -3043,17 +3156,20 @@
         <w:jc w:val="both"/>
         <w:rPr>
           <w:rFonts w:ascii="Poppins" w:hAnsi="Poppins" w:cs="Poppins"/>
+          <w:color w:val="00B050"/>
         </w:rPr>
       </w:pPr>
       <w:r>
         <w:rPr>
           <w:rFonts w:ascii="Segoe UI Symbol" w:hAnsi="Segoe UI Symbol" w:cs="Segoe UI Symbol"/>
+          <w:color w:val="00B050"/>
         </w:rPr>
         <w:t>✓</w:t>
       </w:r>
       <w:r>
         <w:rPr>
           <w:rFonts w:ascii="Poppins" w:hAnsi="Poppins" w:cs="Poppins"/>
+          <w:color w:val="00B050"/>
         </w:rPr>
         <w:t xml:space="preserve"> Una hoja de ruta personal y profesional para los próximos tres años.</w:t>
       </w:r>
@@ -3064,17 +3180,20 @@
         <w:jc w:val="both"/>
         <w:rPr>
           <w:rFonts w:ascii="Poppins" w:hAnsi="Poppins" w:cs="Poppins"/>
+          <w:color w:val="00B050"/>
         </w:rPr>
       </w:pPr>
       <w:r>
         <w:rPr>
           <w:rFonts w:ascii="Segoe UI Symbol" w:hAnsi="Segoe UI Symbol" w:cs="Segoe UI Symbol"/>
+          <w:color w:val="00B050"/>
         </w:rPr>
         <w:t>✓</w:t>
       </w:r>
       <w:r>
         <w:rPr>
           <w:rFonts w:ascii="Poppins" w:hAnsi="Poppins" w:cs="Poppins"/>
+          <w:color w:val="00B050"/>
         </w:rPr>
         <w:t xml:space="preserve"> Herramientas para fortalecer tu liderazgo y aumentar tu impacto.</w:t>
       </w:r>
@@ -3085,17 +3204,20 @@
         <w:jc w:val="both"/>
         <w:rPr>
           <w:rFonts w:ascii="Poppins" w:hAnsi="Poppins" w:cs="Poppins"/>
+          <w:color w:val="00B050"/>
         </w:rPr>
       </w:pPr>
       <w:r>
         <w:rPr>
           <w:rFonts w:ascii="Segoe UI Symbol" w:hAnsi="Segoe UI Symbol" w:cs="Segoe UI Symbol"/>
+          <w:color w:val="00B050"/>
         </w:rPr>
         <w:t>✓</w:t>
       </w:r>
       <w:r>
         <w:rPr>
           <w:rFonts w:ascii="Poppins" w:hAnsi="Poppins" w:cs="Poppins"/>
+          <w:color w:val="00B050"/>
         </w:rPr>
         <w:t xml:space="preserve"> Un plan de desarrollo integral para continuar creciendo.</w:t>
       </w:r>
@@ -3106,17 +3228,20 @@
         <w:jc w:val="both"/>
         <w:rPr>
           <w:rFonts w:ascii="Poppins" w:hAnsi="Poppins" w:cs="Poppins"/>
+          <w:color w:val="00B050"/>
         </w:rPr>
       </w:pPr>
       <w:r>
         <w:rPr>
           <w:rFonts w:ascii="Segoe UI Symbol" w:hAnsi="Segoe UI Symbol" w:cs="Segoe UI Symbol"/>
+          <w:color w:val="00B050"/>
         </w:rPr>
         <w:t>✓</w:t>
       </w:r>
       <w:r>
         <w:rPr>
           <w:rFonts w:ascii="Poppins" w:hAnsi="Poppins" w:cs="Poppins"/>
+          <w:color w:val="00B050"/>
         </w:rPr>
         <w:t xml:space="preserve"> Una comunidad de líderes y empresarios comprometidos con su evolución.</w:t>
       </w:r>
@@ -3127,17 +3252,20 @@
         <w:jc w:val="both"/>
         <w:rPr>
           <w:rFonts w:ascii="Poppins" w:hAnsi="Poppins" w:cs="Poppins"/>
+          <w:color w:val="00B050"/>
         </w:rPr>
       </w:pPr>
       <w:r>
         <w:rPr>
           <w:rFonts w:ascii="Segoe UI Symbol" w:hAnsi="Segoe UI Symbol" w:cs="Segoe UI Symbol"/>
+          <w:color w:val="00B050"/>
         </w:rPr>
         <w:t>✓</w:t>
       </w:r>
       <w:r>
         <w:rPr>
           <w:rFonts w:ascii="Poppins" w:hAnsi="Poppins" w:cs="Poppins"/>
+          <w:color w:val="00B050"/>
         </w:rPr>
         <w:t xml:space="preserve"> Una mayor sensación de coherencia entre la vida que vives y la vida que deseas construir.</w:t>
       </w:r>
@@ -3159,6 +3287,7 @@
           <w:rFonts w:ascii="Poppins" w:hAnsi="Poppins" w:cs="Poppins"/>
           <w:b/>
           <w:bCs/>
+          <w:color w:val="00B050"/>
         </w:rPr>
       </w:pPr>
       <w:r>
@@ -3166,6 +3295,7 @@
           <w:rFonts w:ascii="Poppins" w:hAnsi="Poppins" w:cs="Poppins"/>
           <w:b/>
           <w:bCs/>
+          <w:color w:val="00B050"/>
         </w:rPr>
         <w:t>¿Para quién es Master Live Training?</w:t>
       </w:r>
@@ -3176,20 +3306,23 @@
         <w:jc w:val="both"/>
         <w:rPr>
           <w:rFonts w:ascii="Poppins" w:hAnsi="Poppins" w:cs="Poppins"/>
-        </w:rPr>
-      </w:pPr>
-    </w:p>
-    <w:p>
-      <w:pPr>
-        <w:spacing w:after="0"/>
-        <w:jc w:val="both"/>
-        <w:rPr>
-          <w:rFonts w:ascii="Poppins" w:hAnsi="Poppins" w:cs="Poppins"/>
-        </w:rPr>
-      </w:pPr>
-      <w:r>
-        <w:rPr>
-          <w:rFonts w:ascii="Poppins" w:hAnsi="Poppins" w:cs="Poppins"/>
+          <w:color w:val="00B050"/>
+        </w:rPr>
+      </w:pPr>
+    </w:p>
+    <w:p>
+      <w:pPr>
+        <w:spacing w:after="0"/>
+        <w:jc w:val="both"/>
+        <w:rPr>
+          <w:rFonts w:ascii="Poppins" w:hAnsi="Poppins" w:cs="Poppins"/>
+          <w:color w:val="00B050"/>
+        </w:rPr>
+      </w:pPr>
+      <w:r>
+        <w:rPr>
+          <w:rFonts w:ascii="Poppins" w:hAnsi="Poppins" w:cs="Poppins"/>
+          <w:color w:val="00B050"/>
         </w:rPr>
         <w:t>Este programa ha sido diseñado para empresarios, directivos, gerentes, líderes y profesionales que sienten un compromiso genuino con su crecimiento y están dispuestos a asumir la responsabilidad de su propio desarrollo.</w:t>
       </w:r>
@@ -3200,6 +3333,7 @@
         <w:jc w:val="both"/>
         <w:rPr>
           <w:rFonts w:ascii="Poppins" w:hAnsi="Poppins" w:cs="Poppins"/>
+          <w:color w:val="00B050"/>
         </w:rPr>
       </w:pPr>
     </w:p>
@@ -3226,6 +3360,7 @@
                 <w:rFonts w:ascii="Poppins" w:hAnsi="Poppins" w:cs="Poppins"/>
                 <w:b/>
                 <w:bCs/>
+                <w:color w:val="00B050"/>
               </w:rPr>
             </w:pPr>
             <w:r>
@@ -3233,6 +3368,7 @@
                 <w:rFonts w:ascii="Poppins" w:hAnsi="Poppins" w:cs="Poppins"/>
                 <w:b/>
                 <w:bCs/>
+                <w:color w:val="00B050"/>
               </w:rPr>
               <w:t>Es para personas que:</w:t>
             </w:r>
@@ -3250,6 +3386,7 @@
                 <w:rFonts w:ascii="Poppins" w:hAnsi="Poppins" w:cs="Poppins"/>
                 <w:b/>
                 <w:bCs/>
+                <w:color w:val="00B050"/>
               </w:rPr>
             </w:pPr>
             <w:r>
@@ -3257,6 +3394,7 @@
                 <w:rFonts w:ascii="Poppins" w:hAnsi="Poppins" w:cs="Poppins"/>
                 <w:b/>
                 <w:bCs/>
+                <w:color w:val="00B050"/>
               </w:rPr>
               <w:t>¿Para quién NO es?</w:t>
             </w:r>
@@ -3273,17 +3411,20 @@
               <w:spacing w:line="276" w:lineRule="auto"/>
               <w:rPr>
                 <w:rFonts w:ascii="Poppins" w:hAnsi="Poppins" w:cs="Poppins"/>
+                <w:color w:val="00B050"/>
               </w:rPr>
             </w:pPr>
             <w:r>
               <w:rPr>
                 <w:rFonts w:ascii="Segoe UI Symbol" w:hAnsi="Segoe UI Symbol" w:cs="Segoe UI Symbol"/>
+                <w:color w:val="00B050"/>
               </w:rPr>
               <w:t>✓</w:t>
             </w:r>
             <w:r>
               <w:rPr>
                 <w:rFonts w:ascii="Poppins" w:hAnsi="Poppins" w:cs="Poppins"/>
+                <w:color w:val="00B050"/>
               </w:rPr>
               <w:t xml:space="preserve"> Han alcanzado logros importantes, pero sienten que existe un siguiente nivel de desarrollo personal y profesional por descubrir.</w:t>
             </w:r>
@@ -3293,17 +3434,20 @@
               <w:spacing w:line="276" w:lineRule="auto"/>
               <w:rPr>
                 <w:rFonts w:ascii="Poppins" w:hAnsi="Poppins" w:cs="Poppins"/>
+                <w:color w:val="00B050"/>
               </w:rPr>
             </w:pPr>
             <w:r>
               <w:rPr>
                 <w:rFonts w:ascii="Segoe UI Symbol" w:hAnsi="Segoe UI Symbol" w:cs="Segoe UI Symbol"/>
+                <w:color w:val="00B050"/>
               </w:rPr>
               <w:t>✓</w:t>
             </w:r>
             <w:r>
               <w:rPr>
                 <w:rFonts w:ascii="Poppins" w:hAnsi="Poppins" w:cs="Poppins"/>
+                <w:color w:val="00B050"/>
               </w:rPr>
               <w:t xml:space="preserve"> Buscan mayor claridad sobre quiénes son, qué quieren construir y hacia dónde desean dirigir su vida.</w:t>
             </w:r>
@@ -3313,17 +3457,21 @@
               <w:spacing w:line="276" w:lineRule="auto"/>
               <w:rPr>
                 <w:rFonts w:ascii="Poppins" w:hAnsi="Poppins" w:cs="Poppins"/>
+                <w:color w:val="00B050"/>
               </w:rPr>
             </w:pPr>
             <w:r>
               <w:rPr>
                 <w:rFonts w:ascii="Segoe UI Symbol" w:hAnsi="Segoe UI Symbol" w:cs="Segoe UI Symbol"/>
-              </w:rPr>
+                <w:color w:val="00B050"/>
+              </w:rPr>
+              <w:lastRenderedPageBreak/>
               <w:t>✓</w:t>
             </w:r>
             <w:r>
               <w:rPr>
                 <w:rFonts w:ascii="Poppins" w:hAnsi="Poppins" w:cs="Poppins"/>
+                <w:color w:val="00B050"/>
               </w:rPr>
               <w:t xml:space="preserve"> Desean fortalecer su liderazgo, aumentar su impacto y tomar decisiones más conscientes.</w:t>
             </w:r>
@@ -3333,17 +3481,20 @@
               <w:spacing w:line="276" w:lineRule="auto"/>
               <w:rPr>
                 <w:rFonts w:ascii="Poppins" w:hAnsi="Poppins" w:cs="Poppins"/>
+                <w:color w:val="00B050"/>
               </w:rPr>
             </w:pPr>
             <w:r>
               <w:rPr>
                 <w:rFonts w:ascii="Segoe UI Symbol" w:hAnsi="Segoe UI Symbol" w:cs="Segoe UI Symbol"/>
+                <w:color w:val="00B050"/>
               </w:rPr>
               <w:t>✓</w:t>
             </w:r>
             <w:r>
               <w:rPr>
                 <w:rFonts w:ascii="Poppins" w:hAnsi="Poppins" w:cs="Poppins"/>
+                <w:color w:val="00B050"/>
               </w:rPr>
               <w:t xml:space="preserve"> Reconocen que el crecimiento sostenible requiere trabajar tanto en el ser como en el hacer.</w:t>
             </w:r>
@@ -3353,18 +3504,20 @@
               <w:spacing w:line="276" w:lineRule="auto"/>
               <w:rPr>
                 <w:rFonts w:ascii="Poppins" w:hAnsi="Poppins" w:cs="Poppins"/>
+                <w:color w:val="00B050"/>
               </w:rPr>
             </w:pPr>
             <w:r>
               <w:rPr>
                 <w:rFonts w:ascii="Segoe UI Symbol" w:hAnsi="Segoe UI Symbol" w:cs="Segoe UI Symbol"/>
-              </w:rPr>
-              <w:lastRenderedPageBreak/>
+                <w:color w:val="00B050"/>
+              </w:rPr>
               <w:t>✓</w:t>
             </w:r>
             <w:r>
               <w:rPr>
                 <w:rFonts w:ascii="Poppins" w:hAnsi="Poppins" w:cs="Poppins"/>
+                <w:color w:val="00B050"/>
               </w:rPr>
               <w:t xml:space="preserve"> Están dispuestas a cuestionar creencias, revisar patrones y explorar nuevas posibilidades de desarrollo.</w:t>
             </w:r>
@@ -3374,17 +3527,20 @@
               <w:spacing w:line="276" w:lineRule="auto"/>
               <w:rPr>
                 <w:rFonts w:ascii="Poppins" w:hAnsi="Poppins" w:cs="Poppins"/>
+                <w:color w:val="00B050"/>
               </w:rPr>
             </w:pPr>
             <w:r>
               <w:rPr>
                 <w:rFonts w:ascii="Segoe UI Symbol" w:hAnsi="Segoe UI Symbol" w:cs="Segoe UI Symbol"/>
+                <w:color w:val="00B050"/>
               </w:rPr>
               <w:t>✓</w:t>
             </w:r>
             <w:r>
               <w:rPr>
                 <w:rFonts w:ascii="Poppins" w:hAnsi="Poppins" w:cs="Poppins"/>
+                <w:color w:val="00B050"/>
               </w:rPr>
               <w:t xml:space="preserve"> Comprenden que las herramientas son importantes, pero saben que la verdadera transformación ocurre cuando la persona cambia.</w:t>
             </w:r>
@@ -3394,17 +3550,20 @@
               <w:spacing w:line="276" w:lineRule="auto"/>
               <w:rPr>
                 <w:rFonts w:ascii="Poppins" w:hAnsi="Poppins" w:cs="Poppins"/>
+                <w:color w:val="00B050"/>
               </w:rPr>
             </w:pPr>
             <w:r>
               <w:rPr>
                 <w:rFonts w:ascii="Segoe UI Symbol" w:hAnsi="Segoe UI Symbol" w:cs="Segoe UI Symbol"/>
+                <w:color w:val="00B050"/>
               </w:rPr>
               <w:t>✓</w:t>
             </w:r>
             <w:r>
               <w:rPr>
                 <w:rFonts w:ascii="Poppins" w:hAnsi="Poppins" w:cs="Poppins"/>
+                <w:color w:val="00B050"/>
               </w:rPr>
               <w:t xml:space="preserve"> Valoran el aprendizaje, la reflexión y el intercambio con otras personas comprometidas con su evolución.</w:t>
             </w:r>
@@ -3419,11 +3578,13 @@
               <w:spacing w:line="276" w:lineRule="auto"/>
               <w:rPr>
                 <w:rFonts w:ascii="Poppins" w:hAnsi="Poppins" w:cs="Poppins"/>
+                <w:color w:val="00B050"/>
               </w:rPr>
             </w:pPr>
             <w:r>
               <w:rPr>
                 <w:rFonts w:ascii="Poppins" w:hAnsi="Poppins" w:cs="Poppins"/>
+                <w:color w:val="00B050"/>
               </w:rPr>
               <w:lastRenderedPageBreak/>
               <w:t>Master Live Training probablemente no sea para ti si:</w:t>
@@ -3434,17 +3595,20 @@
               <w:spacing w:line="276" w:lineRule="auto"/>
               <w:rPr>
                 <w:rFonts w:ascii="Poppins" w:hAnsi="Poppins" w:cs="Poppins"/>
+                <w:color w:val="00B050"/>
               </w:rPr>
             </w:pPr>
             <w:r>
               <w:rPr>
                 <w:rFonts w:ascii="Segoe UI Symbol" w:hAnsi="Segoe UI Symbol" w:cs="Segoe UI Symbol"/>
+                <w:color w:val="00B050"/>
               </w:rPr>
               <w:t>✗</w:t>
             </w:r>
             <w:r>
               <w:rPr>
                 <w:rFonts w:ascii="Poppins" w:hAnsi="Poppins" w:cs="Poppins"/>
+                <w:color w:val="00B050"/>
               </w:rPr>
               <w:t xml:space="preserve"> Buscas soluciones rápidas o resultados inmediatos sin un trabajo personal profundo.</w:t>
             </w:r>
@@ -3454,17 +3618,20 @@
               <w:spacing w:line="276" w:lineRule="auto"/>
               <w:rPr>
                 <w:rFonts w:ascii="Poppins" w:hAnsi="Poppins" w:cs="Poppins"/>
+                <w:color w:val="00B050"/>
               </w:rPr>
             </w:pPr>
             <w:r>
               <w:rPr>
                 <w:rFonts w:ascii="Segoe UI Symbol" w:hAnsi="Segoe UI Symbol" w:cs="Segoe UI Symbol"/>
+                <w:color w:val="00B050"/>
               </w:rPr>
               <w:t>✗</w:t>
             </w:r>
             <w:r>
               <w:rPr>
                 <w:rFonts w:ascii="Poppins" w:hAnsi="Poppins" w:cs="Poppins"/>
+                <w:color w:val="00B050"/>
               </w:rPr>
               <w:t xml:space="preserve"> Esperas que alguien más resuelva por ti los desafíos que hoy enfrentas.</w:t>
             </w:r>
@@ -3474,17 +3641,21 @@
               <w:spacing w:line="276" w:lineRule="auto"/>
               <w:rPr>
                 <w:rFonts w:ascii="Poppins" w:hAnsi="Poppins" w:cs="Poppins"/>
+                <w:color w:val="00B050"/>
               </w:rPr>
             </w:pPr>
             <w:r>
               <w:rPr>
                 <w:rFonts w:ascii="Segoe UI Symbol" w:hAnsi="Segoe UI Symbol" w:cs="Segoe UI Symbol"/>
-              </w:rPr>
+                <w:color w:val="00B050"/>
+              </w:rPr>
+              <w:lastRenderedPageBreak/>
               <w:t>✗</w:t>
             </w:r>
             <w:r>
               <w:rPr>
                 <w:rFonts w:ascii="Poppins" w:hAnsi="Poppins" w:cs="Poppins"/>
+                <w:color w:val="00B050"/>
               </w:rPr>
               <w:t xml:space="preserve"> No estás dispuesto a dedicar tiempo a reflexionar, practicar y aplicar lo que aprendas.</w:t>
             </w:r>
@@ -3494,17 +3665,20 @@
               <w:spacing w:line="276" w:lineRule="auto"/>
               <w:rPr>
                 <w:rFonts w:ascii="Poppins" w:hAnsi="Poppins" w:cs="Poppins"/>
+                <w:color w:val="00B050"/>
               </w:rPr>
             </w:pPr>
             <w:r>
               <w:rPr>
                 <w:rFonts w:ascii="Segoe UI Symbol" w:hAnsi="Segoe UI Symbol" w:cs="Segoe UI Symbol"/>
+                <w:color w:val="00B050"/>
               </w:rPr>
               <w:t>✗</w:t>
             </w:r>
             <w:r>
               <w:rPr>
                 <w:rFonts w:ascii="Poppins" w:hAnsi="Poppins" w:cs="Poppins"/>
+                <w:color w:val="00B050"/>
               </w:rPr>
               <w:t xml:space="preserve"> Consideras que ya no tienes nada nuevo por aprender sobre ti mismo.</w:t>
             </w:r>
@@ -3514,18 +3688,20 @@
               <w:spacing w:line="276" w:lineRule="auto"/>
               <w:rPr>
                 <w:rFonts w:ascii="Poppins" w:hAnsi="Poppins" w:cs="Poppins"/>
+                <w:color w:val="00B050"/>
               </w:rPr>
             </w:pPr>
             <w:r>
               <w:rPr>
                 <w:rFonts w:ascii="Segoe UI Symbol" w:hAnsi="Segoe UI Symbol" w:cs="Segoe UI Symbol"/>
-              </w:rPr>
-              <w:lastRenderedPageBreak/>
+                <w:color w:val="00B050"/>
+              </w:rPr>
               <w:t>✗</w:t>
             </w:r>
             <w:r>
               <w:rPr>
                 <w:rFonts w:ascii="Poppins" w:hAnsi="Poppins" w:cs="Poppins"/>
+                <w:color w:val="00B050"/>
               </w:rPr>
               <w:t xml:space="preserve"> Buscas únicamente herramientas de liderazgo, ventas, productividad o gestión sin trabajar sobre la persona que las utiliza.</w:t>
             </w:r>
@@ -3535,17 +3711,20 @@
               <w:spacing w:line="276" w:lineRule="auto"/>
               <w:rPr>
                 <w:rFonts w:ascii="Poppins" w:hAnsi="Poppins" w:cs="Poppins"/>
+                <w:color w:val="00B050"/>
               </w:rPr>
             </w:pPr>
             <w:r>
               <w:rPr>
                 <w:rFonts w:ascii="Segoe UI Symbol" w:hAnsi="Segoe UI Symbol" w:cs="Segoe UI Symbol"/>
+                <w:color w:val="00B050"/>
               </w:rPr>
               <w:t>✗</w:t>
             </w:r>
             <w:r>
               <w:rPr>
                 <w:rFonts w:ascii="Poppins" w:hAnsi="Poppins" w:cs="Poppins"/>
+                <w:color w:val="00B050"/>
               </w:rPr>
               <w:t xml:space="preserve"> No estás dispuesto a cuestionar algunas de las ideas, hábitos o creencias que te han traído hasta aquí.</w:t>
             </w:r>
@@ -3559,44 +3738,51 @@
         <w:jc w:val="both"/>
         <w:rPr>
           <w:rFonts w:ascii="Poppins" w:hAnsi="Poppins" w:cs="Poppins"/>
-        </w:rPr>
-      </w:pPr>
-    </w:p>
-    <w:p>
-      <w:pPr>
-        <w:spacing w:after="0"/>
-        <w:jc w:val="both"/>
-        <w:rPr>
-          <w:rFonts w:ascii="Poppins" w:hAnsi="Poppins" w:cs="Poppins"/>
-        </w:rPr>
-      </w:pPr>
-      <w:r>
-        <w:rPr>
-          <w:rFonts w:ascii="Poppins" w:hAnsi="Poppins" w:cs="Poppins"/>
+          <w:color w:val="00B050"/>
+        </w:rPr>
+      </w:pPr>
+    </w:p>
+    <w:p>
+      <w:pPr>
+        <w:spacing w:after="0"/>
+        <w:jc w:val="both"/>
+        <w:rPr>
+          <w:rFonts w:ascii="Poppins" w:hAnsi="Poppins" w:cs="Poppins"/>
+          <w:color w:val="00B050"/>
+        </w:rPr>
+      </w:pPr>
+      <w:r>
+        <w:rPr>
+          <w:rFonts w:ascii="Poppins" w:hAnsi="Poppins" w:cs="Poppins"/>
+          <w:color w:val="00B050"/>
         </w:rPr>
         <w:t>Este no es un programa para quienes quieren hacer más</w:t>
       </w:r>
       <w:r>
         <w:rPr>
           <w:rFonts w:ascii="Poppins" w:hAnsi="Poppins" w:cs="Poppins"/>
+          <w:color w:val="00B050"/>
         </w:rPr>
         <w:t>,</w:t>
       </w:r>
       <w:r>
         <w:rPr>
           <w:rFonts w:ascii="Poppins" w:hAnsi="Poppins" w:cs="Poppins"/>
+          <w:color w:val="00B050"/>
         </w:rPr>
         <w:t xml:space="preserve"> </w:t>
       </w:r>
       <w:r>
         <w:rPr>
           <w:rFonts w:ascii="Poppins" w:hAnsi="Poppins" w:cs="Poppins"/>
+          <w:color w:val="00B050"/>
         </w:rPr>
         <w:t>e</w:t>
       </w:r>
       <w:r>
         <w:rPr>
           <w:rFonts w:ascii="Poppins" w:hAnsi="Poppins" w:cs="Poppins"/>
+          <w:color w:val="00B050"/>
         </w:rPr>
         <w:t>s un programa para quienes están dispuestos a convertirse en una mejor versión de sí mismos para sostener una vida, un liderazgo y un impacto mayor.</w:t>
       </w:r>
@@ -3618,6 +3804,7 @@
           <w:rFonts w:ascii="Poppins" w:hAnsi="Poppins" w:cs="Poppins"/>
           <w:b/>
           <w:bCs/>
+          <w:color w:val="00B050"/>
         </w:rPr>
       </w:pPr>
       <w:r>
@@ -3626,248 +3813,285 @@
           <w:b/>
           <w:bCs/>
         </w:rPr>
-        <w:t>¿Por qué creamos Master Live Training?</w:t>
-      </w:r>
-    </w:p>
-    <w:p>
-      <w:pPr>
-        <w:spacing w:after="0"/>
-        <w:jc w:val="both"/>
-        <w:rPr>
-          <w:rFonts w:ascii="Poppins" w:hAnsi="Poppins" w:cs="Poppins"/>
-        </w:rPr>
-      </w:pPr>
-    </w:p>
-    <w:p>
-      <w:pPr>
-        <w:spacing w:after="0"/>
-        <w:jc w:val="both"/>
-        <w:rPr>
-          <w:rFonts w:ascii="Poppins" w:hAnsi="Poppins" w:cs="Poppins"/>
-        </w:rPr>
-      </w:pPr>
-      <w:r>
-        <w:rPr>
-          <w:rFonts w:ascii="Poppins" w:hAnsi="Poppins" w:cs="Poppins"/>
-        </w:rPr>
-        <w:t>Durante más de dos décadas hemos acompañado a miles de personas, líderes, empresarios, emprendedores y equipos en procesos de desarrollo humano, liderazgo y transformación organizacional.</w:t>
-      </w:r>
-    </w:p>
-    <w:p>
-      <w:pPr>
-        <w:spacing w:after="0"/>
-        <w:jc w:val="both"/>
-        <w:rPr>
-          <w:rFonts w:ascii="Poppins" w:hAnsi="Poppins" w:cs="Poppins"/>
-        </w:rPr>
-      </w:pPr>
-    </w:p>
-    <w:p>
-      <w:pPr>
-        <w:spacing w:after="0"/>
-        <w:jc w:val="both"/>
-        <w:rPr>
-          <w:rFonts w:ascii="Poppins" w:hAnsi="Poppins" w:cs="Poppins"/>
-        </w:rPr>
-      </w:pPr>
-      <w:r>
-        <w:rPr>
-          <w:rFonts w:ascii="Poppins" w:hAnsi="Poppins" w:cs="Poppins"/>
-        </w:rPr>
-        <w:t>A lo largo de ese camino hemos observado algo que se repite una y otra vez.</w:t>
-      </w:r>
-      <w:r>
-        <w:rPr>
-          <w:rFonts w:ascii="Poppins" w:hAnsi="Poppins" w:cs="Poppins"/>
-        </w:rPr>
-        <w:t xml:space="preserve"> </w:t>
-      </w:r>
-      <w:r>
-        <w:rPr>
-          <w:rFonts w:ascii="Poppins" w:hAnsi="Poppins" w:cs="Poppins"/>
-        </w:rPr>
-        <w:t xml:space="preserve"> </w:t>
-      </w:r>
-      <w:r>
-        <w:rPr>
-          <w:rFonts w:ascii="Poppins" w:hAnsi="Poppins" w:cs="Poppins"/>
-        </w:rPr>
-        <w:t>Personas brillantes, talentosas y comprometidas que, aun habiendo alcanzado importantes logros profesionales, continúan sintiendo preguntas que ninguna posición, reconocimiento o resultado parece responder completamente.</w:t>
-      </w:r>
-    </w:p>
-    <w:p>
-      <w:pPr>
-        <w:spacing w:after="0"/>
-        <w:jc w:val="both"/>
-        <w:rPr>
-          <w:rFonts w:ascii="Poppins" w:hAnsi="Poppins" w:cs="Poppins"/>
-        </w:rPr>
-      </w:pPr>
-    </w:p>
-    <w:p>
-      <w:pPr>
-        <w:spacing w:after="0"/>
-        <w:ind w:left="720"/>
-        <w:jc w:val="both"/>
-        <w:rPr>
-          <w:rFonts w:ascii="Poppins" w:hAnsi="Poppins" w:cs="Poppins"/>
-        </w:rPr>
-      </w:pPr>
-      <w:r>
-        <w:rPr>
-          <w:rFonts w:ascii="Poppins" w:hAnsi="Poppins" w:cs="Poppins"/>
-        </w:rPr>
-        <w:t>¿Cómo encontrar una mayor claridad sobre mi vida?</w:t>
-      </w:r>
-    </w:p>
-    <w:p>
-      <w:pPr>
-        <w:spacing w:after="0"/>
-        <w:ind w:left="720"/>
-        <w:jc w:val="both"/>
-        <w:rPr>
-          <w:rFonts w:ascii="Poppins" w:hAnsi="Poppins" w:cs="Poppins"/>
-        </w:rPr>
-      </w:pPr>
-    </w:p>
-    <w:p>
-      <w:pPr>
-        <w:spacing w:after="0"/>
-        <w:ind w:left="720"/>
-        <w:jc w:val="both"/>
-        <w:rPr>
-          <w:rFonts w:ascii="Poppins" w:hAnsi="Poppins" w:cs="Poppins"/>
-        </w:rPr>
-      </w:pPr>
-      <w:r>
-        <w:rPr>
-          <w:rFonts w:ascii="Poppins" w:hAnsi="Poppins" w:cs="Poppins"/>
-        </w:rPr>
-        <w:t>¿Cómo ejercer un liderazgo más consciente?</w:t>
-      </w:r>
-    </w:p>
-    <w:p>
-      <w:pPr>
-        <w:spacing w:after="0"/>
-        <w:ind w:left="720"/>
-        <w:jc w:val="both"/>
-        <w:rPr>
-          <w:rFonts w:ascii="Poppins" w:hAnsi="Poppins" w:cs="Poppins"/>
-        </w:rPr>
-      </w:pPr>
-    </w:p>
-    <w:p>
-      <w:pPr>
-        <w:spacing w:after="0"/>
-        <w:ind w:left="720"/>
-        <w:jc w:val="both"/>
-        <w:rPr>
-          <w:rFonts w:ascii="Poppins" w:hAnsi="Poppins" w:cs="Poppins"/>
-        </w:rPr>
-      </w:pPr>
-      <w:r>
-        <w:rPr>
-          <w:rFonts w:ascii="Poppins" w:hAnsi="Poppins" w:cs="Poppins"/>
-        </w:rPr>
-        <w:t>¿Cómo sostener mayores responsabilidades sin perder el equilibrio?</w:t>
-      </w:r>
-    </w:p>
-    <w:p>
-      <w:pPr>
-        <w:spacing w:after="0"/>
-        <w:ind w:left="720"/>
-        <w:jc w:val="both"/>
-        <w:rPr>
-          <w:rFonts w:ascii="Poppins" w:hAnsi="Poppins" w:cs="Poppins"/>
-        </w:rPr>
-      </w:pPr>
-    </w:p>
-    <w:p>
-      <w:pPr>
-        <w:spacing w:after="0"/>
-        <w:ind w:left="720"/>
-        <w:jc w:val="both"/>
-        <w:rPr>
-          <w:rFonts w:ascii="Poppins" w:hAnsi="Poppins" w:cs="Poppins"/>
-        </w:rPr>
-      </w:pPr>
-      <w:r>
-        <w:rPr>
-          <w:rFonts w:ascii="Poppins" w:hAnsi="Poppins" w:cs="Poppins"/>
-        </w:rPr>
-        <w:t>¿Cómo crecer profesionalmente sin desconectarme de mí mismo?</w:t>
-      </w:r>
-    </w:p>
-    <w:p>
-      <w:pPr>
-        <w:spacing w:after="0"/>
-        <w:ind w:left="720"/>
-        <w:jc w:val="both"/>
-        <w:rPr>
-          <w:rFonts w:ascii="Poppins" w:hAnsi="Poppins" w:cs="Poppins"/>
-        </w:rPr>
-      </w:pPr>
-      <w:r>
-        <w:rPr>
-          <w:rFonts w:ascii="Poppins" w:hAnsi="Poppins" w:cs="Poppins"/>
-        </w:rPr>
-        <w:lastRenderedPageBreak/>
-        <w:t>¿Cómo construir una vida más coherente con aquello que realmente considero importante?</w:t>
-      </w:r>
-    </w:p>
-    <w:p>
-      <w:pPr>
-        <w:spacing w:after="0"/>
-        <w:jc w:val="both"/>
-        <w:rPr>
-          <w:rFonts w:ascii="Poppins" w:hAnsi="Poppins" w:cs="Poppins"/>
-        </w:rPr>
-      </w:pPr>
-    </w:p>
-    <w:p>
-      <w:pPr>
-        <w:spacing w:after="0"/>
-        <w:jc w:val="both"/>
-        <w:rPr>
-          <w:rFonts w:ascii="Poppins" w:hAnsi="Poppins" w:cs="Poppins"/>
-        </w:rPr>
-      </w:pPr>
-      <w:r>
-        <w:rPr>
-          <w:rFonts w:ascii="Poppins" w:hAnsi="Poppins" w:cs="Poppins"/>
-        </w:rPr>
-        <w:t>Estas preguntas no suelen resolverse con más información.</w:t>
-      </w:r>
-      <w:r>
-        <w:rPr>
-          <w:rFonts w:ascii="Poppins" w:hAnsi="Poppins" w:cs="Poppins"/>
-        </w:rPr>
-        <w:t xml:space="preserve"> </w:t>
-      </w:r>
-      <w:r>
-        <w:rPr>
-          <w:rFonts w:ascii="Poppins" w:hAnsi="Poppins" w:cs="Poppins"/>
-        </w:rPr>
-        <w:t>Requieren un proceso más profundo de autoconocimiento, reflexión, desarrollo y acción.</w:t>
-      </w:r>
-    </w:p>
-    <w:p>
-      <w:pPr>
-        <w:spacing w:after="0"/>
-        <w:jc w:val="both"/>
-        <w:rPr>
-          <w:rFonts w:ascii="Poppins" w:hAnsi="Poppins" w:cs="Poppins"/>
-        </w:rPr>
-      </w:pPr>
-    </w:p>
-    <w:p>
-      <w:pPr>
-        <w:spacing w:after="0"/>
-        <w:jc w:val="center"/>
+        <w:t>¿</w:t>
+      </w:r>
+      <w:r>
         <w:rPr>
           <w:rFonts w:ascii="Poppins" w:hAnsi="Poppins" w:cs="Poppins"/>
           <w:b/>
           <w:bCs/>
+          <w:color w:val="00B050"/>
+        </w:rPr>
+        <w:t>Por qué creamos Master Live Training?</w:t>
+      </w:r>
+    </w:p>
+    <w:p>
+      <w:pPr>
+        <w:spacing w:after="0"/>
+        <w:jc w:val="both"/>
+        <w:rPr>
+          <w:rFonts w:ascii="Poppins" w:hAnsi="Poppins" w:cs="Poppins"/>
+          <w:color w:val="00B050"/>
+        </w:rPr>
+      </w:pPr>
+    </w:p>
+    <w:p>
+      <w:pPr>
+        <w:spacing w:after="0"/>
+        <w:jc w:val="both"/>
+        <w:rPr>
+          <w:rFonts w:ascii="Poppins" w:hAnsi="Poppins" w:cs="Poppins"/>
+          <w:color w:val="00B050"/>
+        </w:rPr>
+      </w:pPr>
+      <w:r>
+        <w:rPr>
+          <w:rFonts w:ascii="Poppins" w:hAnsi="Poppins" w:cs="Poppins"/>
+          <w:color w:val="00B050"/>
+        </w:rPr>
+        <w:t>Durante más de dos décadas hemos acompañado a miles de personas, líderes, empresarios, emprendedores y equipos en procesos de desarrollo humano, liderazgo y transformación organizacional.</w:t>
+      </w:r>
+    </w:p>
+    <w:p>
+      <w:pPr>
+        <w:spacing w:after="0"/>
+        <w:jc w:val="both"/>
+        <w:rPr>
+          <w:rFonts w:ascii="Poppins" w:hAnsi="Poppins" w:cs="Poppins"/>
+          <w:color w:val="00B050"/>
+        </w:rPr>
+      </w:pPr>
+    </w:p>
+    <w:p>
+      <w:pPr>
+        <w:spacing w:after="0"/>
+        <w:jc w:val="both"/>
+        <w:rPr>
+          <w:rFonts w:ascii="Poppins" w:hAnsi="Poppins" w:cs="Poppins"/>
+          <w:color w:val="00B050"/>
+        </w:rPr>
+      </w:pPr>
+      <w:r>
+        <w:rPr>
+          <w:rFonts w:ascii="Poppins" w:hAnsi="Poppins" w:cs="Poppins"/>
+          <w:color w:val="00B050"/>
+        </w:rPr>
+        <w:t>A lo largo de ese camino hemos observado algo que se repite una y otra vez.</w:t>
+      </w:r>
+      <w:r>
+        <w:rPr>
+          <w:rFonts w:ascii="Poppins" w:hAnsi="Poppins" w:cs="Poppins"/>
+          <w:color w:val="00B050"/>
+        </w:rPr>
+        <w:t xml:space="preserve"> </w:t>
+      </w:r>
+      <w:r>
+        <w:rPr>
+          <w:rFonts w:ascii="Poppins" w:hAnsi="Poppins" w:cs="Poppins"/>
+          <w:color w:val="00B050"/>
+        </w:rPr>
+        <w:t xml:space="preserve"> </w:t>
+      </w:r>
+      <w:r>
+        <w:rPr>
+          <w:rFonts w:ascii="Poppins" w:hAnsi="Poppins" w:cs="Poppins"/>
+          <w:color w:val="00B050"/>
+        </w:rPr>
+        <w:t>Personas brillantes, talentosas y comprometidas que, aun habiendo alcanzado importantes logros profesionales, continúan sintiendo preguntas que ninguna posición, reconocimiento o resultado parece responder completamente.</w:t>
+      </w:r>
+    </w:p>
+    <w:p>
+      <w:pPr>
+        <w:spacing w:after="0"/>
+        <w:jc w:val="both"/>
+        <w:rPr>
+          <w:rFonts w:ascii="Poppins" w:hAnsi="Poppins" w:cs="Poppins"/>
+          <w:color w:val="00B050"/>
+        </w:rPr>
+      </w:pPr>
+    </w:p>
+    <w:p>
+      <w:pPr>
+        <w:spacing w:after="0"/>
+        <w:ind w:left="720"/>
+        <w:jc w:val="both"/>
+        <w:rPr>
+          <w:rFonts w:ascii="Poppins" w:hAnsi="Poppins" w:cs="Poppins"/>
+          <w:color w:val="00B050"/>
+        </w:rPr>
+      </w:pPr>
+      <w:r>
+        <w:rPr>
+          <w:rFonts w:ascii="Poppins" w:hAnsi="Poppins" w:cs="Poppins"/>
+          <w:color w:val="00B050"/>
+        </w:rPr>
+        <w:t>¿Cómo encontrar una mayor claridad sobre mi vida?</w:t>
+      </w:r>
+    </w:p>
+    <w:p>
+      <w:pPr>
+        <w:spacing w:after="0"/>
+        <w:ind w:left="720"/>
+        <w:jc w:val="both"/>
+        <w:rPr>
+          <w:rFonts w:ascii="Poppins" w:hAnsi="Poppins" w:cs="Poppins"/>
+          <w:color w:val="00B050"/>
+        </w:rPr>
+      </w:pPr>
+    </w:p>
+    <w:p>
+      <w:pPr>
+        <w:spacing w:after="0"/>
+        <w:ind w:left="720"/>
+        <w:jc w:val="both"/>
+        <w:rPr>
+          <w:rFonts w:ascii="Poppins" w:hAnsi="Poppins" w:cs="Poppins"/>
+          <w:color w:val="00B050"/>
+        </w:rPr>
+      </w:pPr>
+      <w:r>
+        <w:rPr>
+          <w:rFonts w:ascii="Poppins" w:hAnsi="Poppins" w:cs="Poppins"/>
+          <w:color w:val="00B050"/>
+        </w:rPr>
+        <w:lastRenderedPageBreak/>
+        <w:t>¿Cómo ejercer un liderazgo más consciente?</w:t>
+      </w:r>
+    </w:p>
+    <w:p>
+      <w:pPr>
+        <w:spacing w:after="0"/>
+        <w:ind w:left="720"/>
+        <w:jc w:val="both"/>
+        <w:rPr>
+          <w:rFonts w:ascii="Poppins" w:hAnsi="Poppins" w:cs="Poppins"/>
+          <w:color w:val="00B050"/>
+        </w:rPr>
+      </w:pPr>
+    </w:p>
+    <w:p>
+      <w:pPr>
+        <w:spacing w:after="0"/>
+        <w:ind w:left="720"/>
+        <w:jc w:val="both"/>
+        <w:rPr>
+          <w:rFonts w:ascii="Poppins" w:hAnsi="Poppins" w:cs="Poppins"/>
+          <w:color w:val="00B050"/>
+        </w:rPr>
+      </w:pPr>
+      <w:r>
+        <w:rPr>
+          <w:rFonts w:ascii="Poppins" w:hAnsi="Poppins" w:cs="Poppins"/>
+          <w:color w:val="00B050"/>
+        </w:rPr>
+        <w:t>¿Cómo sostener mayores responsabilidades sin perder el equilibrio?</w:t>
+      </w:r>
+    </w:p>
+    <w:p>
+      <w:pPr>
+        <w:spacing w:after="0"/>
+        <w:ind w:left="720"/>
+        <w:jc w:val="both"/>
+        <w:rPr>
+          <w:rFonts w:ascii="Poppins" w:hAnsi="Poppins" w:cs="Poppins"/>
+          <w:color w:val="00B050"/>
+        </w:rPr>
+      </w:pPr>
+    </w:p>
+    <w:p>
+      <w:pPr>
+        <w:spacing w:after="0"/>
+        <w:ind w:left="720"/>
+        <w:jc w:val="both"/>
+        <w:rPr>
+          <w:rFonts w:ascii="Poppins" w:hAnsi="Poppins" w:cs="Poppins"/>
+          <w:color w:val="00B050"/>
+        </w:rPr>
+      </w:pPr>
+      <w:r>
+        <w:rPr>
+          <w:rFonts w:ascii="Poppins" w:hAnsi="Poppins" w:cs="Poppins"/>
+          <w:color w:val="00B050"/>
+        </w:rPr>
+        <w:t>¿Cómo crecer profesionalmente sin desconectarme de mí mismo?</w:t>
+      </w:r>
+    </w:p>
+    <w:p>
+      <w:pPr>
+        <w:spacing w:after="0"/>
+        <w:ind w:left="720"/>
+        <w:jc w:val="both"/>
+        <w:rPr>
+          <w:rFonts w:ascii="Poppins" w:hAnsi="Poppins" w:cs="Poppins"/>
+          <w:color w:val="00B050"/>
+        </w:rPr>
+      </w:pPr>
+      <w:r>
+        <w:rPr>
+          <w:rFonts w:ascii="Poppins" w:hAnsi="Poppins" w:cs="Poppins"/>
+          <w:color w:val="00B050"/>
+        </w:rPr>
+        <w:t>¿Cómo construir una vida más coherente con aquello que realmente considero importante?</w:t>
+      </w:r>
+    </w:p>
+    <w:p>
+      <w:pPr>
+        <w:spacing w:after="0"/>
+        <w:jc w:val="both"/>
+        <w:rPr>
+          <w:rFonts w:ascii="Poppins" w:hAnsi="Poppins" w:cs="Poppins"/>
+        </w:rPr>
+      </w:pPr>
+    </w:p>
+    <w:p>
+      <w:pPr>
+        <w:spacing w:after="0"/>
+        <w:jc w:val="both"/>
+        <w:rPr>
+          <w:rFonts w:ascii="Poppins" w:hAnsi="Poppins" w:cs="Poppins"/>
+          <w:color w:val="00B050"/>
+        </w:rPr>
+      </w:pPr>
+      <w:r>
+        <w:rPr>
+          <w:rFonts w:ascii="Poppins" w:hAnsi="Poppins" w:cs="Poppins"/>
+          <w:color w:val="00B050"/>
+        </w:rPr>
+        <w:t>Estas preguntas no suelen resolverse con más información.</w:t>
+      </w:r>
+      <w:r>
+        <w:rPr>
+          <w:rFonts w:ascii="Poppins" w:hAnsi="Poppins" w:cs="Poppins"/>
+          <w:color w:val="00B050"/>
+        </w:rPr>
+        <w:t xml:space="preserve"> </w:t>
+      </w:r>
+      <w:r>
+        <w:rPr>
+          <w:rFonts w:ascii="Poppins" w:hAnsi="Poppins" w:cs="Poppins"/>
+          <w:color w:val="00B050"/>
+        </w:rPr>
+        <w:t>Requieren un proceso más profundo de autoconocimiento, reflexión, desarrollo y acción.</w:t>
+      </w:r>
+    </w:p>
+    <w:p>
+      <w:pPr>
+        <w:spacing w:after="0"/>
+        <w:jc w:val="both"/>
+        <w:rPr>
+          <w:rFonts w:ascii="Poppins" w:hAnsi="Poppins" w:cs="Poppins"/>
+        </w:rPr>
+      </w:pPr>
+    </w:p>
+    <w:p>
+      <w:pPr>
+        <w:spacing w:after="0"/>
+        <w:jc w:val="center"/>
+        <w:rPr>
+          <w:rFonts w:ascii="Poppins" w:hAnsi="Poppins" w:cs="Poppins"/>
+          <w:b/>
+          <w:bCs/>
+          <w:color w:val="00B050"/>
           <w:sz w:val="28"/>
           <w:szCs w:val="28"/>
         </w:rPr>
@@ -3877,6 +4101,7 @@
           <w:rFonts w:ascii="Poppins" w:hAnsi="Poppins" w:cs="Poppins"/>
           <w:b/>
           <w:bCs/>
+          <w:color w:val="00B050"/>
           <w:sz w:val="28"/>
           <w:szCs w:val="28"/>
         </w:rPr>
@@ -3889,20 +4114,23 @@
         <w:jc w:val="both"/>
         <w:rPr>
           <w:rFonts w:ascii="Poppins" w:hAnsi="Poppins" w:cs="Poppins"/>
-        </w:rPr>
-      </w:pPr>
-    </w:p>
-    <w:p>
-      <w:pPr>
-        <w:spacing w:after="0"/>
-        <w:jc w:val="both"/>
-        <w:rPr>
-          <w:rFonts w:ascii="Poppins" w:hAnsi="Poppins" w:cs="Poppins"/>
-        </w:rPr>
-      </w:pPr>
-      <w:r>
-        <w:rPr>
-          <w:rFonts w:ascii="Poppins" w:hAnsi="Poppins" w:cs="Poppins"/>
+          <w:color w:val="00B050"/>
+        </w:rPr>
+      </w:pPr>
+    </w:p>
+    <w:p>
+      <w:pPr>
+        <w:spacing w:after="0"/>
+        <w:jc w:val="both"/>
+        <w:rPr>
+          <w:rFonts w:ascii="Poppins" w:hAnsi="Poppins" w:cs="Poppins"/>
+          <w:color w:val="00B050"/>
+        </w:rPr>
+      </w:pPr>
+      <w:r>
+        <w:rPr>
+          <w:rFonts w:ascii="Poppins" w:hAnsi="Poppins" w:cs="Poppins"/>
+          <w:color w:val="00B050"/>
         </w:rPr>
         <w:t>Es el resultado de años de experiencia acompañando personas, estudiando el comportamiento humano y desarrollando metodologías que permitan integrar crecimiento personal, liderazgo, propósito y consciencia en una sola experiencia.</w:t>
       </w:r>
@@ -3913,11 +4141,13 @@
         <w:jc w:val="both"/>
         <w:rPr>
           <w:rFonts w:ascii="Poppins" w:hAnsi="Poppins" w:cs="Poppins"/>
-        </w:rPr>
-      </w:pPr>
-      <w:r>
-        <w:rPr>
-          <w:rFonts w:ascii="Poppins" w:hAnsi="Poppins" w:cs="Poppins"/>
+          <w:color w:val="00B050"/>
+        </w:rPr>
+      </w:pPr>
+      <w:r>
+        <w:rPr>
+          <w:rFonts w:ascii="Poppins" w:hAnsi="Poppins" w:cs="Poppins"/>
+          <w:color w:val="00B050"/>
         </w:rPr>
         <w:t>No creemos que exista una fórmula única para el éxito.</w:t>
       </w:r>
@@ -3928,44 +4158,51 @@
         <w:jc w:val="both"/>
         <w:rPr>
           <w:rFonts w:ascii="Poppins" w:hAnsi="Poppins" w:cs="Poppins"/>
-        </w:rPr>
-      </w:pPr>
-    </w:p>
-    <w:p>
-      <w:pPr>
-        <w:spacing w:after="0"/>
-        <w:jc w:val="both"/>
-        <w:rPr>
-          <w:rFonts w:ascii="Poppins" w:hAnsi="Poppins" w:cs="Poppins"/>
-        </w:rPr>
-      </w:pPr>
-      <w:r>
-        <w:rPr>
-          <w:rFonts w:ascii="Poppins" w:hAnsi="Poppins" w:cs="Poppins"/>
+          <w:color w:val="00B050"/>
+        </w:rPr>
+      </w:pPr>
+    </w:p>
+    <w:p>
+      <w:pPr>
+        <w:spacing w:after="0"/>
+        <w:jc w:val="both"/>
+        <w:rPr>
+          <w:rFonts w:ascii="Poppins" w:hAnsi="Poppins" w:cs="Poppins"/>
+          <w:color w:val="00B050"/>
+        </w:rPr>
+      </w:pPr>
+      <w:r>
+        <w:rPr>
+          <w:rFonts w:ascii="Poppins" w:hAnsi="Poppins" w:cs="Poppins"/>
+          <w:color w:val="00B050"/>
         </w:rPr>
         <w:t>Tampoco creemos que todas las personas deban recorrer el mismo camino.</w:t>
       </w:r>
       <w:r>
         <w:rPr>
           <w:rFonts w:ascii="Poppins" w:hAnsi="Poppins" w:cs="Poppins"/>
+          <w:color w:val="00B050"/>
         </w:rPr>
         <w:t xml:space="preserve"> </w:t>
       </w:r>
       <w:r>
         <w:rPr>
           <w:rFonts w:ascii="Poppins" w:hAnsi="Poppins" w:cs="Poppins"/>
+          <w:color w:val="00B050"/>
         </w:rPr>
         <w:t>Lo que sí creemos es que cada ser humano posee un potencial mucho mayor del que normalmente expresa y que, cuando aprende a conocerse mejor, desarrollar sus capacidades y actuar de manera coherente con aquello que realmente importa, su vida comienza a transformarse de una manera mucho más profunda y sostenible.</w:t>
       </w:r>
       <w:r>
         <w:rPr>
           <w:rFonts w:ascii="Poppins" w:hAnsi="Poppins" w:cs="Poppins"/>
+          <w:color w:val="00B050"/>
         </w:rPr>
         <w:t xml:space="preserve"> </w:t>
       </w:r>
       <w:r>
         <w:rPr>
           <w:rFonts w:ascii="Poppins" w:hAnsi="Poppins" w:cs="Poppins"/>
+          <w:color w:val="00B050"/>
         </w:rPr>
         <w:t>Ese es el propósito que da origen a Master Live Training.</w:t>
       </w:r>
@@ -4043,38 +4280,38 @@
         <w:rPr>
           <w:rFonts w:ascii="Poppins" w:hAnsi="Poppins" w:cs="Poppins"/>
         </w:rPr>
-        <w:t>Detrás de esta experiencia está Felipe Beltrán Hernández, conferencista, mentor, escritor y creador de metodologías de desarrollo humano y liderazgo, con una trayectoria construida al servicio de personas y organizaciones que buscan crecer de manera más consciente, auténtica y sostenible.</w:t>
-      </w:r>
-    </w:p>
-    <w:p>
-      <w:pPr>
-        <w:spacing w:after="0"/>
-        <w:jc w:val="both"/>
-        <w:rPr>
-          <w:rFonts w:ascii="Poppins" w:hAnsi="Poppins" w:cs="Poppins"/>
-        </w:rPr>
-      </w:pPr>
-    </w:p>
-    <w:p>
-      <w:pPr>
-        <w:spacing w:after="0"/>
-        <w:jc w:val="both"/>
-        <w:rPr>
-          <w:rFonts w:ascii="Poppins" w:hAnsi="Poppins" w:cs="Poppins"/>
-        </w:rPr>
-      </w:pPr>
-      <w:r>
-        <w:rPr>
-          <w:rFonts w:ascii="Poppins" w:hAnsi="Poppins" w:cs="Poppins"/>
-        </w:rPr>
-        <w:t xml:space="preserve">A lo largo de su recorrido ha acompañado procesos en diferentes ciudades, países, empresas, comunidades y escenarios de formación, integrando herramientas de </w:t>
+        <w:t xml:space="preserve">Detrás de esta experiencia está Felipe Beltrán Hernández, conferencista, mentor, escritor y creador de metodologías de desarrollo humano y liderazgo, con una </w:t>
       </w:r>
       <w:r>
         <w:rPr>
           <w:rFonts w:ascii="Poppins" w:hAnsi="Poppins" w:cs="Poppins"/>
         </w:rPr>
         <w:lastRenderedPageBreak/>
-        <w:t>autoconocimiento, liderazgo, propósito, comunicación, innovación, estrategia y desarrollo personal.</w:t>
+        <w:t>trayectoria construida al servicio de personas y organizaciones que buscan crecer de manera más consciente, auténtica y sostenible.</w:t>
+      </w:r>
+    </w:p>
+    <w:p>
+      <w:pPr>
+        <w:spacing w:after="0"/>
+        <w:jc w:val="both"/>
+        <w:rPr>
+          <w:rFonts w:ascii="Poppins" w:hAnsi="Poppins" w:cs="Poppins"/>
+        </w:rPr>
+      </w:pPr>
+    </w:p>
+    <w:p>
+      <w:pPr>
+        <w:spacing w:after="0"/>
+        <w:jc w:val="both"/>
+        <w:rPr>
+          <w:rFonts w:ascii="Poppins" w:hAnsi="Poppins" w:cs="Poppins"/>
+        </w:rPr>
+      </w:pPr>
+      <w:r>
+        <w:rPr>
+          <w:rFonts w:ascii="Poppins" w:hAnsi="Poppins" w:cs="Poppins"/>
+        </w:rPr>
+        <w:t>A lo largo de su recorrido ha acompañado procesos en diferentes ciudades, países, empresas, comunidades y escenarios de formación, integrando herramientas de autoconocimiento, liderazgo, propósito, comunicación, innovación, estrategia y desarrollo personal.</w:t>
       </w:r>
     </w:p>
     <w:p>
@@ -4118,6 +4355,7 @@
           <w:rFonts w:ascii="Poppins" w:hAnsi="Poppins" w:cs="Poppins"/>
           <w:b/>
           <w:bCs/>
+          <w:color w:val="00B050"/>
         </w:rPr>
       </w:pPr>
       <w:r>
@@ -4125,6 +4363,7 @@
           <w:rFonts w:ascii="Poppins" w:hAnsi="Poppins" w:cs="Poppins"/>
           <w:b/>
           <w:bCs/>
+          <w:color w:val="00B050"/>
         </w:rPr>
         <w:t>Algunos datos de esta trayectoria:</w:t>
       </w:r>
@@ -4135,26 +4374,30 @@
         <w:jc w:val="both"/>
         <w:rPr>
           <w:rFonts w:ascii="Poppins" w:hAnsi="Poppins" w:cs="Poppins"/>
-        </w:rPr>
-      </w:pPr>
-    </w:p>
-    <w:p>
-      <w:pPr>
-        <w:spacing w:after="0"/>
-        <w:jc w:val="both"/>
-        <w:rPr>
-          <w:rFonts w:ascii="Poppins" w:hAnsi="Poppins" w:cs="Poppins"/>
+          <w:color w:val="00B050"/>
+        </w:rPr>
+      </w:pPr>
+    </w:p>
+    <w:p>
+      <w:pPr>
+        <w:spacing w:after="0"/>
+        <w:jc w:val="both"/>
+        <w:rPr>
+          <w:rFonts w:ascii="Poppins" w:hAnsi="Poppins" w:cs="Poppins"/>
+          <w:color w:val="00B050"/>
         </w:rPr>
       </w:pPr>
       <w:r>
         <w:rPr>
           <w:rFonts w:ascii="Segoe UI Symbol" w:hAnsi="Segoe UI Symbol" w:cs="Segoe UI Symbol"/>
+          <w:color w:val="00B050"/>
         </w:rPr>
         <w:t>✓</w:t>
       </w:r>
       <w:r>
         <w:rPr>
           <w:rFonts w:ascii="Poppins" w:hAnsi="Poppins" w:cs="Poppins"/>
+          <w:color w:val="00B050"/>
         </w:rPr>
         <w:t xml:space="preserve"> Más de 25 años de experiencia en procesos de desarrollo humano, liderazgo y emprendimiento.</w:t>
       </w:r>
@@ -4165,17 +4408,20 @@
         <w:jc w:val="both"/>
         <w:rPr>
           <w:rFonts w:ascii="Poppins" w:hAnsi="Poppins" w:cs="Poppins"/>
+          <w:color w:val="00B050"/>
         </w:rPr>
       </w:pPr>
       <w:r>
         <w:rPr>
           <w:rFonts w:ascii="Segoe UI Symbol" w:hAnsi="Segoe UI Symbol" w:cs="Segoe UI Symbol"/>
+          <w:color w:val="00B050"/>
         </w:rPr>
         <w:t>✓</w:t>
       </w:r>
       <w:r>
         <w:rPr>
           <w:rFonts w:ascii="Poppins" w:hAnsi="Poppins" w:cs="Poppins"/>
+          <w:color w:val="00B050"/>
         </w:rPr>
         <w:t xml:space="preserve"> Más de 18 años como conferencista y facilitador.</w:t>
       </w:r>
@@ -4186,17 +4432,20 @@
         <w:jc w:val="both"/>
         <w:rPr>
           <w:rFonts w:ascii="Poppins" w:hAnsi="Poppins" w:cs="Poppins"/>
+          <w:color w:val="00B050"/>
         </w:rPr>
       </w:pPr>
       <w:r>
         <w:rPr>
           <w:rFonts w:ascii="Segoe UI Symbol" w:hAnsi="Segoe UI Symbol" w:cs="Segoe UI Symbol"/>
+          <w:color w:val="00B050"/>
         </w:rPr>
         <w:t>✓</w:t>
       </w:r>
       <w:r>
         <w:rPr>
           <w:rFonts w:ascii="Poppins" w:hAnsi="Poppins" w:cs="Poppins"/>
+          <w:color w:val="00B050"/>
         </w:rPr>
         <w:t xml:space="preserve"> Más de 58.000 personas impactadas.</w:t>
       </w:r>
@@ -4207,17 +4456,20 @@
         <w:jc w:val="both"/>
         <w:rPr>
           <w:rFonts w:ascii="Poppins" w:hAnsi="Poppins" w:cs="Poppins"/>
+          <w:color w:val="00B050"/>
         </w:rPr>
       </w:pPr>
       <w:r>
         <w:rPr>
           <w:rFonts w:ascii="Segoe UI Symbol" w:hAnsi="Segoe UI Symbol" w:cs="Segoe UI Symbol"/>
+          <w:color w:val="00B050"/>
         </w:rPr>
         <w:t>✓</w:t>
       </w:r>
       <w:r>
         <w:rPr>
           <w:rFonts w:ascii="Poppins" w:hAnsi="Poppins" w:cs="Poppins"/>
+          <w:color w:val="00B050"/>
         </w:rPr>
         <w:t xml:space="preserve"> Presencia en más de 32 ciudades y 6 países.</w:t>
       </w:r>
@@ -4228,17 +4480,20 @@
         <w:jc w:val="both"/>
         <w:rPr>
           <w:rFonts w:ascii="Poppins" w:hAnsi="Poppins" w:cs="Poppins"/>
+          <w:color w:val="00B050"/>
         </w:rPr>
       </w:pPr>
       <w:r>
         <w:rPr>
           <w:rFonts w:ascii="Segoe UI Symbol" w:hAnsi="Segoe UI Symbol" w:cs="Segoe UI Symbol"/>
+          <w:color w:val="00B050"/>
         </w:rPr>
         <w:t>✓</w:t>
       </w:r>
       <w:r>
         <w:rPr>
           <w:rFonts w:ascii="Poppins" w:hAnsi="Poppins" w:cs="Poppins"/>
+          <w:color w:val="00B050"/>
         </w:rPr>
         <w:t xml:space="preserve"> Creador de metodologías propias de autoconocimiento, liderazgo y desarrollo integral.</w:t>
       </w:r>
@@ -4249,17 +4504,20 @@
         <w:jc w:val="both"/>
         <w:rPr>
           <w:rFonts w:ascii="Poppins" w:hAnsi="Poppins" w:cs="Poppins"/>
+          <w:color w:val="00B050"/>
         </w:rPr>
       </w:pPr>
       <w:r>
         <w:rPr>
           <w:rFonts w:ascii="Segoe UI Symbol" w:hAnsi="Segoe UI Symbol" w:cs="Segoe UI Symbol"/>
+          <w:color w:val="00B050"/>
         </w:rPr>
         <w:t>✓</w:t>
       </w:r>
       <w:r>
         <w:rPr>
           <w:rFonts w:ascii="Poppins" w:hAnsi="Poppins" w:cs="Poppins"/>
+          <w:color w:val="00B050"/>
         </w:rPr>
         <w:t xml:space="preserve"> Experiencia acompañando líderes, empresarios, emprendedores, equipos y organizaciones en procesos de transformación.</w:t>
       </w:r>
@@ -4270,32 +4528,37 @@
         <w:jc w:val="both"/>
         <w:rPr>
           <w:rFonts w:ascii="Poppins" w:hAnsi="Poppins" w:cs="Poppins"/>
-        </w:rPr>
-      </w:pPr>
-    </w:p>
-    <w:p>
-      <w:pPr>
-        <w:spacing w:after="0"/>
-        <w:jc w:val="both"/>
-        <w:rPr>
-          <w:rFonts w:ascii="Poppins" w:hAnsi="Poppins" w:cs="Poppins"/>
-        </w:rPr>
-      </w:pPr>
-      <w:r>
-        <w:rPr>
-          <w:rFonts w:ascii="Poppins" w:hAnsi="Poppins" w:cs="Poppins"/>
+          <w:color w:val="00B050"/>
+        </w:rPr>
+      </w:pPr>
+    </w:p>
+    <w:p>
+      <w:pPr>
+        <w:spacing w:after="0"/>
+        <w:jc w:val="both"/>
+        <w:rPr>
+          <w:rFonts w:ascii="Poppins" w:hAnsi="Poppins" w:cs="Poppins"/>
+          <w:color w:val="00B050"/>
+        </w:rPr>
+      </w:pPr>
+      <w:r>
+        <w:rPr>
+          <w:rFonts w:ascii="Poppins" w:hAnsi="Poppins" w:cs="Poppins"/>
+          <w:color w:val="00B050"/>
         </w:rPr>
         <w:t>Más que cifras, estos años han dejado una convicción profunda: las personas no necesitan únicamente</w:t>
       </w:r>
       <w:r>
         <w:rPr>
           <w:rFonts w:ascii="Poppins" w:hAnsi="Poppins" w:cs="Poppins"/>
+          <w:color w:val="00B050"/>
         </w:rPr>
         <w:t xml:space="preserve"> solo</w:t>
       </w:r>
       <w:r>
         <w:rPr>
           <w:rFonts w:ascii="Poppins" w:hAnsi="Poppins" w:cs="Poppins"/>
+          <w:color w:val="00B050"/>
         </w:rPr>
         <w:t xml:space="preserve"> información. Necesitan espacios, conversaciones, experiencias y caminos que les ayuden a integrar lo que saben, reconocer quiénes son y convertirse en personas más conscientes, sólidas y coherentes con la vida que desean construir.</w:t>
       </w:r>
@@ -4349,6 +4612,7 @@
         <w:rPr>
           <w:rFonts w:ascii="Poppins" w:hAnsi="Poppins" w:cs="Poppins"/>
         </w:rPr>
+        <w:lastRenderedPageBreak/>
         <w:t>La Primera Generación de Master Live Training no representa el inicio de nuestra experiencia. Representa la integración de años de aprendizaje, investigación, acompañamiento y desarrollo metodológico.</w:t>
       </w:r>
     </w:p>
@@ -4373,14 +4637,7 @@
         <w:rPr>
           <w:rFonts w:ascii="Poppins" w:hAnsi="Poppins" w:cs="Poppins"/>
         </w:rPr>
-        <w:t xml:space="preserve">Durante más de dos décadas hemos acompañado a miles de personas en procesos de desarrollo humano, liderazgo, emprendimiento, propósito y transformación </w:t>
-      </w:r>
-      <w:r>
-        <w:rPr>
-          <w:rFonts w:ascii="Poppins" w:hAnsi="Poppins" w:cs="Poppins"/>
-        </w:rPr>
-        <w:lastRenderedPageBreak/>
-        <w:t>personal. A lo largo de ese camino hemos desarrollado programas, experiencias, talleres, mentorías y metodologías que han generado cambios significativos en la vida de muchas personas.</w:t>
+        <w:t>Durante más de dos décadas hemos acompañado a miles de personas en procesos de desarrollo humano, liderazgo, emprendimiento, propósito y transformación personal. A lo largo de ese camino hemos desarrollado programas, experiencias, talleres, mentorías y metodologías que han generado cambios significativos en la vida de muchas personas.</w:t>
       </w:r>
     </w:p>
     <w:p>
@@ -4461,6 +4718,7 @@
         <w:jc w:val="both"/>
         <w:rPr>
           <w:rFonts w:ascii="Poppins" w:hAnsi="Poppins" w:cs="Poppins"/>
+          <w:color w:val="00B050"/>
         </w:rPr>
       </w:pPr>
     </w:p>
@@ -4472,6 +4730,7 @@
           <w:rFonts w:ascii="Poppins" w:hAnsi="Poppins" w:cs="Poppins"/>
           <w:b/>
           <w:bCs/>
+          <w:color w:val="00B050"/>
           <w:sz w:val="28"/>
           <w:szCs w:val="28"/>
         </w:rPr>
@@ -4481,6 +4740,7 @@
           <w:rFonts w:ascii="Poppins" w:hAnsi="Poppins" w:cs="Poppins"/>
           <w:b/>
           <w:bCs/>
+          <w:color w:val="00B050"/>
           <w:sz w:val="28"/>
           <w:szCs w:val="28"/>
         </w:rPr>
@@ -4493,20 +4753,23 @@
         <w:jc w:val="both"/>
         <w:rPr>
           <w:rFonts w:ascii="Poppins" w:hAnsi="Poppins" w:cs="Poppins"/>
-        </w:rPr>
-      </w:pPr>
-    </w:p>
-    <w:p>
-      <w:pPr>
-        <w:spacing w:after="0"/>
-        <w:jc w:val="both"/>
-        <w:rPr>
-          <w:rFonts w:ascii="Poppins" w:hAnsi="Poppins" w:cs="Poppins"/>
-        </w:rPr>
-      </w:pPr>
-      <w:r>
-        <w:rPr>
-          <w:rFonts w:ascii="Poppins" w:hAnsi="Poppins" w:cs="Poppins"/>
+          <w:color w:val="00B050"/>
+        </w:rPr>
+      </w:pPr>
+    </w:p>
+    <w:p>
+      <w:pPr>
+        <w:spacing w:after="0"/>
+        <w:jc w:val="both"/>
+        <w:rPr>
+          <w:rFonts w:ascii="Poppins" w:hAnsi="Poppins" w:cs="Poppins"/>
+          <w:color w:val="00B050"/>
+        </w:rPr>
+      </w:pPr>
+      <w:r>
+        <w:rPr>
+          <w:rFonts w:ascii="Poppins" w:hAnsi="Poppins" w:cs="Poppins"/>
+          <w:color w:val="00B050"/>
         </w:rPr>
         <w:t>Queremos construir una experiencia cercana, profunda y significativa, en la que cada participante tenga la oportunidad de ser escuchado, acompañado y retado en su proceso de desarrollo.</w:t>
       </w:r>
@@ -4517,69 +4780,52 @@
         <w:jc w:val="both"/>
         <w:rPr>
           <w:rFonts w:ascii="Poppins" w:hAnsi="Poppins" w:cs="Poppins"/>
-        </w:rPr>
-      </w:pPr>
-    </w:p>
-    <w:p>
-      <w:pPr>
-        <w:spacing w:after="0"/>
-        <w:jc w:val="both"/>
-        <w:rPr>
-          <w:rFonts w:ascii="Poppins" w:hAnsi="Poppins" w:cs="Poppins"/>
-        </w:rPr>
-      </w:pPr>
-      <w:r>
-        <w:rPr>
-          <w:rFonts w:ascii="Poppins" w:hAnsi="Poppins" w:cs="Poppins"/>
-        </w:rPr>
-        <w:t>No buscamos reunir a la mayor cantidad posible de personas</w:t>
-      </w:r>
-      <w:r>
-        <w:rPr>
-          <w:rFonts w:ascii="Poppins" w:hAnsi="Poppins" w:cs="Poppins"/>
-        </w:rPr>
-        <w:t>, b</w:t>
-      </w:r>
-      <w:r>
-        <w:rPr>
-          <w:rFonts w:ascii="Poppins" w:hAnsi="Poppins" w:cs="Poppins"/>
-        </w:rPr>
-        <w:t xml:space="preserve">uscamos </w:t>
-      </w:r>
-      <w:r>
-        <w:rPr>
-          <w:rFonts w:ascii="Poppins" w:hAnsi="Poppins" w:cs="Poppins"/>
-        </w:rPr>
-        <w:t>identificar</w:t>
-      </w:r>
-      <w:r>
-        <w:rPr>
-          <w:rFonts w:ascii="Poppins" w:hAnsi="Poppins" w:cs="Poppins"/>
-        </w:rPr>
-        <w:t xml:space="preserve"> a las personas correctas.</w:t>
-      </w:r>
-    </w:p>
-    <w:p>
-      <w:pPr>
-        <w:spacing w:after="0"/>
-        <w:jc w:val="both"/>
-        <w:rPr>
-          <w:rFonts w:ascii="Poppins" w:hAnsi="Poppins" w:cs="Poppins"/>
-        </w:rPr>
-      </w:pPr>
-    </w:p>
-    <w:p>
-      <w:pPr>
-        <w:spacing w:after="0"/>
-        <w:jc w:val="both"/>
-        <w:rPr>
-          <w:rFonts w:ascii="Poppins" w:hAnsi="Poppins" w:cs="Poppins"/>
-        </w:rPr>
-      </w:pPr>
-      <w:r>
-        <w:rPr>
-          <w:rFonts w:ascii="Poppins" w:hAnsi="Poppins" w:cs="Poppins"/>
-        </w:rPr>
+          <w:color w:val="00B050"/>
+        </w:rPr>
+      </w:pPr>
+    </w:p>
+    <w:p>
+      <w:pPr>
+        <w:spacing w:after="0"/>
+        <w:jc w:val="both"/>
+        <w:rPr>
+          <w:rFonts w:ascii="Poppins" w:hAnsi="Poppins" w:cs="Poppins"/>
+          <w:color w:val="00B050"/>
+        </w:rPr>
+      </w:pPr>
+      <w:r>
+        <w:rPr>
+          <w:rFonts w:ascii="Poppins" w:hAnsi="Poppins" w:cs="Poppins"/>
+          <w:color w:val="00B050"/>
+        </w:rPr>
+        <w:t>No buscamos reunir a la mayor cantidad posible de personas, buscamos identificar a las personas correctas.</w:t>
+      </w:r>
+    </w:p>
+    <w:p>
+      <w:pPr>
+        <w:spacing w:after="0"/>
+        <w:jc w:val="both"/>
+        <w:rPr>
+          <w:rFonts w:ascii="Poppins" w:hAnsi="Poppins" w:cs="Poppins"/>
+          <w:color w:val="00B050"/>
+        </w:rPr>
+      </w:pPr>
+    </w:p>
+    <w:p>
+      <w:pPr>
+        <w:spacing w:after="0"/>
+        <w:jc w:val="both"/>
+        <w:rPr>
+          <w:rFonts w:ascii="Poppins" w:hAnsi="Poppins" w:cs="Poppins"/>
+          <w:color w:val="00B050"/>
+        </w:rPr>
+      </w:pPr>
+      <w:r>
+        <w:rPr>
+          <w:rFonts w:ascii="Poppins" w:hAnsi="Poppins" w:cs="Poppins"/>
+          <w:color w:val="00B050"/>
+        </w:rPr>
+        <w:lastRenderedPageBreak/>
         <w:t>Aquellas que sienten que ha llegado el momento de invertir en sí mismas, fortalecer la persona en la que se están convirtiendo y construir una vida más coherente con aquello que realmente consideran importante.</w:t>
       </w:r>
     </w:p>
@@ -4589,11 +4835,13 @@
         <w:jc w:val="both"/>
         <w:rPr>
           <w:rFonts w:ascii="Poppins" w:hAnsi="Poppins" w:cs="Poppins"/>
-        </w:rPr>
-      </w:pPr>
-      <w:r>
-        <w:rPr>
-          <w:rFonts w:ascii="Poppins" w:hAnsi="Poppins" w:cs="Poppins"/>
+          <w:color w:val="00B050"/>
+        </w:rPr>
+      </w:pPr>
+      <w:r>
+        <w:rPr>
+          <w:rFonts w:ascii="Poppins" w:hAnsi="Poppins" w:cs="Poppins"/>
+          <w:color w:val="00B050"/>
         </w:rPr>
         <w:t>Los integrantes de esta Primera Generación no solo recorrerán el proceso completo de Master Live Training.</w:t>
       </w:r>
@@ -4604,20 +4852,23 @@
         <w:jc w:val="both"/>
         <w:rPr>
           <w:rFonts w:ascii="Poppins" w:hAnsi="Poppins" w:cs="Poppins"/>
-        </w:rPr>
-      </w:pPr>
-    </w:p>
-    <w:p>
-      <w:pPr>
-        <w:spacing w:after="0"/>
-        <w:jc w:val="both"/>
-        <w:rPr>
-          <w:rFonts w:ascii="Poppins" w:hAnsi="Poppins" w:cs="Poppins"/>
-        </w:rPr>
-      </w:pPr>
-      <w:r>
-        <w:rPr>
-          <w:rFonts w:ascii="Poppins" w:hAnsi="Poppins" w:cs="Poppins"/>
+          <w:color w:val="00B050"/>
+        </w:rPr>
+      </w:pPr>
+    </w:p>
+    <w:p>
+      <w:pPr>
+        <w:spacing w:after="0"/>
+        <w:jc w:val="both"/>
+        <w:rPr>
+          <w:rFonts w:ascii="Poppins" w:hAnsi="Poppins" w:cs="Poppins"/>
+          <w:color w:val="00B050"/>
+        </w:rPr>
+      </w:pPr>
+      <w:r>
+        <w:rPr>
+          <w:rFonts w:ascii="Poppins" w:hAnsi="Poppins" w:cs="Poppins"/>
+          <w:color w:val="00B050"/>
         </w:rPr>
         <w:t>También tendrán la oportunidad de convertirse en los miembros fundadores de una comunidad que seguirá creciendo y evolucionando durante los próximos años.</w:t>
       </w:r>
@@ -4628,46 +4879,24 @@
         <w:jc w:val="both"/>
         <w:rPr>
           <w:rFonts w:ascii="Poppins" w:hAnsi="Poppins" w:cs="Poppins"/>
-        </w:rPr>
-      </w:pPr>
-      <w:r>
-        <w:rPr>
-          <w:rFonts w:ascii="Poppins" w:hAnsi="Poppins" w:cs="Poppins"/>
-        </w:rPr>
-        <w:lastRenderedPageBreak/>
-        <w:t>Por eso el ingreso se realiza mediante un proceso de aplicación.</w:t>
-      </w:r>
-      <w:r>
-        <w:rPr>
-          <w:rFonts w:ascii="Poppins" w:hAnsi="Poppins" w:cs="Poppins"/>
-        </w:rPr>
-        <w:t xml:space="preserve"> </w:t>
-      </w:r>
-      <w:r>
-        <w:rPr>
-          <w:rFonts w:ascii="Poppins" w:hAnsi="Poppins" w:cs="Poppins"/>
-        </w:rPr>
-        <w:t>No porque sea un programa exclusivo para unos pocos</w:t>
-      </w:r>
-      <w:r>
-        <w:rPr>
-          <w:rFonts w:ascii="Poppins" w:hAnsi="Poppins" w:cs="Poppins"/>
-        </w:rPr>
-        <w:t xml:space="preserve">, solo </w:t>
-      </w:r>
-      <w:r>
-        <w:rPr>
-          <w:rFonts w:ascii="Poppins" w:hAnsi="Poppins" w:cs="Poppins"/>
-        </w:rPr>
-        <w:t>queremos asegurarnos de que las personas que ingresen estén preparadas para aprovechar plenamente esta experiencia y aportar valor al camino que recorrerán junto a otros participantes.</w:t>
-      </w:r>
-    </w:p>
-    <w:p>
-      <w:pPr>
-        <w:spacing w:after="0"/>
-        <w:jc w:val="both"/>
-        <w:rPr>
-          <w:rFonts w:ascii="Poppins" w:hAnsi="Poppins" w:cs="Poppins"/>
+          <w:color w:val="00B050"/>
+        </w:rPr>
+      </w:pPr>
+      <w:r>
+        <w:rPr>
+          <w:rFonts w:ascii="Poppins" w:hAnsi="Poppins" w:cs="Poppins"/>
+          <w:color w:val="00B050"/>
+        </w:rPr>
+        <w:t>Por eso el ingreso se realiza mediante un proceso de aplicación. No porque sea un programa exclusivo para unos pocos, solo queremos asegurarnos de que las personas que ingresen estén preparadas para aprovechar plenamente esta experiencia y aportar valor al camino que recorrerán junto a otros participantes.</w:t>
+      </w:r>
+    </w:p>
+    <w:p>
+      <w:pPr>
+        <w:spacing w:after="0"/>
+        <w:jc w:val="both"/>
+        <w:rPr>
+          <w:rFonts w:ascii="Poppins" w:hAnsi="Poppins" w:cs="Poppins"/>
+          <w:color w:val="00B050"/>
         </w:rPr>
       </w:pPr>
     </w:p>
@@ -4679,6 +4908,7 @@
           <w:rFonts w:ascii="Poppins" w:hAnsi="Poppins" w:cs="Poppins"/>
           <w:b/>
           <w:bCs/>
+          <w:color w:val="00B050"/>
           <w:sz w:val="24"/>
           <w:szCs w:val="24"/>
         </w:rPr>
@@ -4688,6 +4918,7 @@
           <w:rFonts w:ascii="Poppins" w:hAnsi="Poppins" w:cs="Poppins"/>
           <w:b/>
           <w:bCs/>
+          <w:color w:val="00B050"/>
           <w:sz w:val="24"/>
           <w:szCs w:val="24"/>
         </w:rPr>
@@ -4711,6 +4942,7 @@
           <w:rFonts w:ascii="Poppins" w:hAnsi="Poppins" w:cs="Poppins"/>
           <w:b/>
           <w:bCs/>
+          <w:color w:val="00B050"/>
         </w:rPr>
       </w:pPr>
       <w:r>
@@ -4718,6 +4950,7 @@
           <w:rFonts w:ascii="Poppins" w:hAnsi="Poppins" w:cs="Poppins"/>
           <w:b/>
           <w:bCs/>
+          <w:color w:val="00B050"/>
         </w:rPr>
         <w:t>Inversión</w:t>
       </w:r>
@@ -5059,6 +5292,7 @@
           <w:rFonts w:ascii="Segoe UI Symbol" w:hAnsi="Segoe UI Symbol" w:cs="Segoe UI Symbol"/>
           <w:color w:val="00B050"/>
         </w:rPr>
+        <w:lastRenderedPageBreak/>
         <w:t>✓</w:t>
       </w:r>
       <w:r>
@@ -5145,106 +5379,289 @@
           <w:bCs/>
           <w:color w:val="00B050"/>
         </w:rPr>
+        <w:t>Preguntas Frecuentes</w:t>
+      </w:r>
+    </w:p>
+    <w:p>
+      <w:pPr>
+        <w:spacing w:after="0"/>
+        <w:jc w:val="both"/>
+        <w:rPr>
+          <w:rFonts w:ascii="Poppins" w:hAnsi="Poppins" w:cs="Poppins"/>
+          <w:color w:val="00B050"/>
+        </w:rPr>
+      </w:pPr>
+    </w:p>
+    <w:p>
+      <w:pPr>
+        <w:spacing w:after="0"/>
+        <w:jc w:val="both"/>
+        <w:rPr>
+          <w:rFonts w:ascii="Poppins" w:hAnsi="Poppins" w:cs="Poppins"/>
+          <w:color w:val="00B050"/>
+        </w:rPr>
+      </w:pPr>
+      <w:r>
+        <w:rPr>
+          <w:rFonts w:ascii="Poppins" w:hAnsi="Poppins" w:cs="Poppins"/>
+          <w:color w:val="00B050"/>
+        </w:rPr>
+        <w:t>¿Master Live Training es un programa de liderazgo?</w:t>
+      </w:r>
+    </w:p>
+    <w:p>
+      <w:pPr>
+        <w:spacing w:after="0"/>
+        <w:jc w:val="both"/>
+        <w:rPr>
+          <w:rFonts w:ascii="Poppins" w:hAnsi="Poppins" w:cs="Poppins"/>
+          <w:color w:val="00B050"/>
+        </w:rPr>
+      </w:pPr>
+      <w:r>
+        <w:rPr>
+          <w:rFonts w:ascii="Poppins" w:hAnsi="Poppins" w:cs="Poppins"/>
+          <w:color w:val="00B050"/>
+        </w:rPr>
+        <w:t>Sí y no.</w:t>
+      </w:r>
+    </w:p>
+    <w:p>
+      <w:pPr>
+        <w:spacing w:after="0"/>
+        <w:jc w:val="both"/>
+        <w:rPr>
+          <w:rFonts w:ascii="Poppins" w:hAnsi="Poppins" w:cs="Poppins"/>
+          <w:color w:val="00B050"/>
+        </w:rPr>
+      </w:pPr>
+    </w:p>
+    <w:p>
+      <w:pPr>
+        <w:spacing w:after="0"/>
+        <w:jc w:val="both"/>
+        <w:rPr>
+          <w:rFonts w:ascii="Poppins" w:hAnsi="Poppins" w:cs="Poppins"/>
+          <w:color w:val="00B050"/>
+        </w:rPr>
+      </w:pPr>
+      <w:r>
+        <w:rPr>
+          <w:rFonts w:ascii="Poppins" w:hAnsi="Poppins" w:cs="Poppins"/>
+          <w:color w:val="00B050"/>
+        </w:rPr>
+        <w:t>Desarrollarás habilidades que fortalecerán tu liderazgo, pero Master Live Training va mucho más allá. Ha sido diseñado para desarrollar de manera integral a la persona que sostiene al líder, porque creemos que el liderazgo es una consecuencia de quién eres y no únicamente de lo que sabes.</w:t>
+      </w:r>
+    </w:p>
+    <w:p>
+      <w:pPr>
+        <w:spacing w:after="0"/>
+        <w:jc w:val="both"/>
+        <w:rPr>
+          <w:rFonts w:ascii="Poppins" w:hAnsi="Poppins" w:cs="Poppins"/>
+          <w:color w:val="00B050"/>
+        </w:rPr>
+      </w:pPr>
+    </w:p>
+    <w:p>
+      <w:pPr>
+        <w:spacing w:after="0"/>
+        <w:jc w:val="both"/>
+        <w:rPr>
+          <w:rFonts w:ascii="Poppins" w:hAnsi="Poppins" w:cs="Poppins"/>
+          <w:color w:val="00B050"/>
+        </w:rPr>
+      </w:pPr>
+      <w:r>
+        <w:rPr>
+          <w:rFonts w:ascii="Poppins" w:hAnsi="Poppins" w:cs="Poppins"/>
+          <w:color w:val="00B050"/>
+        </w:rPr>
+        <w:t>¿Necesito ser empresario o dirigir un equipo para participar?</w:t>
+      </w:r>
+    </w:p>
+    <w:p>
+      <w:pPr>
+        <w:spacing w:after="0"/>
+        <w:jc w:val="both"/>
+        <w:rPr>
+          <w:rFonts w:ascii="Poppins" w:hAnsi="Poppins" w:cs="Poppins"/>
+          <w:color w:val="00B050"/>
+        </w:rPr>
+      </w:pPr>
+      <w:r>
+        <w:rPr>
+          <w:rFonts w:ascii="Poppins" w:hAnsi="Poppins" w:cs="Poppins"/>
+          <w:color w:val="00B050"/>
+        </w:rPr>
+        <w:t>No.</w:t>
+      </w:r>
+    </w:p>
+    <w:p>
+      <w:pPr>
+        <w:spacing w:after="0"/>
+        <w:jc w:val="both"/>
+        <w:rPr>
+          <w:rFonts w:ascii="Poppins" w:hAnsi="Poppins" w:cs="Poppins"/>
+          <w:color w:val="00B050"/>
+        </w:rPr>
+      </w:pPr>
+      <w:r>
+        <w:rPr>
+          <w:rFonts w:ascii="Poppins" w:hAnsi="Poppins" w:cs="Poppins"/>
+          <w:color w:val="00B050"/>
+        </w:rPr>
+        <w:t>Aunque muchos participantes son empresarios, directivos o líderes de equipos, la experiencia está dirigida a cualquier persona comprometida con su crecimiento personal y profesional que desee desarrollar una vida con mayor claridad, dirección, coherencia e impacto.</w:t>
+      </w:r>
+    </w:p>
+    <w:p>
+      <w:pPr>
+        <w:spacing w:after="0"/>
+        <w:jc w:val="both"/>
+        <w:rPr>
+          <w:rFonts w:ascii="Poppins" w:hAnsi="Poppins" w:cs="Poppins"/>
+          <w:color w:val="00B050"/>
+        </w:rPr>
+      </w:pPr>
+    </w:p>
+    <w:p>
+      <w:pPr>
+        <w:spacing w:after="0"/>
+        <w:jc w:val="both"/>
+        <w:rPr>
+          <w:rFonts w:ascii="Poppins" w:hAnsi="Poppins" w:cs="Poppins"/>
+          <w:color w:val="00B050"/>
+        </w:rPr>
+      </w:pPr>
+      <w:r>
+        <w:rPr>
+          <w:rFonts w:ascii="Poppins" w:hAnsi="Poppins" w:cs="Poppins"/>
+          <w:color w:val="00B050"/>
+        </w:rPr>
+        <w:t>¿Cuánto tiempo debo dedicar al programa?</w:t>
+      </w:r>
+    </w:p>
+    <w:p>
+      <w:pPr>
+        <w:spacing w:after="0"/>
+        <w:jc w:val="both"/>
+        <w:rPr>
+          <w:rFonts w:ascii="Poppins" w:hAnsi="Poppins" w:cs="Poppins"/>
+          <w:color w:val="00B050"/>
+        </w:rPr>
+      </w:pPr>
+      <w:r>
+        <w:rPr>
+          <w:rFonts w:ascii="Poppins" w:hAnsi="Poppins" w:cs="Poppins"/>
+          <w:color w:val="00B050"/>
+        </w:rPr>
+        <w:t>Hemos diseñado una experiencia exigente pero compatible con la vida profesional de personas ocupadas.</w:t>
+      </w:r>
+    </w:p>
+    <w:p>
+      <w:pPr>
+        <w:spacing w:after="0"/>
+        <w:jc w:val="both"/>
+        <w:rPr>
+          <w:rFonts w:ascii="Poppins" w:hAnsi="Poppins" w:cs="Poppins"/>
+          <w:color w:val="00B050"/>
+        </w:rPr>
+      </w:pPr>
+      <w:r>
+        <w:rPr>
+          <w:rFonts w:ascii="Poppins" w:hAnsi="Poppins" w:cs="Poppins"/>
+          <w:color w:val="00B050"/>
+        </w:rPr>
+        <w:t>Además de las sesiones programadas, recomendamos destinar algunas horas semanales para la reflexión, las prácticas y la aplicación de los aprendizajes en tu vida personal y profesional.</w:t>
+      </w:r>
+    </w:p>
+    <w:p>
+      <w:pPr>
+        <w:spacing w:after="0"/>
+        <w:jc w:val="both"/>
+        <w:rPr>
+          <w:rFonts w:ascii="Poppins" w:hAnsi="Poppins" w:cs="Poppins"/>
+          <w:color w:val="00B050"/>
+        </w:rPr>
+      </w:pPr>
+    </w:p>
+    <w:p>
+      <w:pPr>
+        <w:spacing w:after="0"/>
+        <w:jc w:val="both"/>
+        <w:rPr>
+          <w:rFonts w:ascii="Poppins" w:hAnsi="Poppins" w:cs="Poppins"/>
+          <w:color w:val="00B050"/>
+        </w:rPr>
+      </w:pPr>
+      <w:r>
+        <w:rPr>
+          <w:rFonts w:ascii="Poppins" w:hAnsi="Poppins" w:cs="Poppins"/>
+          <w:color w:val="00B050"/>
+        </w:rPr>
+        <w:t>¿Qué sucede si no puedo asistir a alguna sesión?</w:t>
+      </w:r>
+    </w:p>
+    <w:p>
+      <w:pPr>
+        <w:spacing w:after="0"/>
+        <w:jc w:val="both"/>
+        <w:rPr>
+          <w:rFonts w:ascii="Poppins" w:hAnsi="Poppins" w:cs="Poppins"/>
+          <w:color w:val="00B050"/>
+        </w:rPr>
+      </w:pPr>
+      <w:r>
+        <w:rPr>
+          <w:rFonts w:ascii="Poppins" w:hAnsi="Poppins" w:cs="Poppins"/>
+          <w:color w:val="00B050"/>
+        </w:rPr>
         <w:lastRenderedPageBreak/>
-        <w:t>Preguntas Frecuentes</w:t>
-      </w:r>
-    </w:p>
-    <w:p>
-      <w:pPr>
-        <w:spacing w:after="0"/>
-        <w:jc w:val="both"/>
-        <w:rPr>
-          <w:rFonts w:ascii="Poppins" w:hAnsi="Poppins" w:cs="Poppins"/>
-          <w:color w:val="00B050"/>
-        </w:rPr>
-      </w:pPr>
-    </w:p>
-    <w:p>
-      <w:pPr>
-        <w:spacing w:after="0"/>
-        <w:jc w:val="both"/>
-        <w:rPr>
-          <w:rFonts w:ascii="Poppins" w:hAnsi="Poppins" w:cs="Poppins"/>
-          <w:color w:val="00B050"/>
-        </w:rPr>
-      </w:pPr>
-      <w:r>
-        <w:rPr>
-          <w:rFonts w:ascii="Poppins" w:hAnsi="Poppins" w:cs="Poppins"/>
-          <w:color w:val="00B050"/>
-        </w:rPr>
-        <w:t>¿Master Live Training es un programa de liderazgo?</w:t>
-      </w:r>
-    </w:p>
-    <w:p>
-      <w:pPr>
-        <w:spacing w:after="0"/>
-        <w:jc w:val="both"/>
-        <w:rPr>
-          <w:rFonts w:ascii="Poppins" w:hAnsi="Poppins" w:cs="Poppins"/>
-          <w:color w:val="00B050"/>
-        </w:rPr>
-      </w:pPr>
-      <w:r>
-        <w:rPr>
-          <w:rFonts w:ascii="Poppins" w:hAnsi="Poppins" w:cs="Poppins"/>
-          <w:color w:val="00B050"/>
-        </w:rPr>
-        <w:t>Sí y no.</w:t>
-      </w:r>
-    </w:p>
-    <w:p>
-      <w:pPr>
-        <w:spacing w:after="0"/>
-        <w:jc w:val="both"/>
-        <w:rPr>
-          <w:rFonts w:ascii="Poppins" w:hAnsi="Poppins" w:cs="Poppins"/>
-          <w:color w:val="00B050"/>
-        </w:rPr>
-      </w:pPr>
-    </w:p>
-    <w:p>
-      <w:pPr>
-        <w:spacing w:after="0"/>
-        <w:jc w:val="both"/>
-        <w:rPr>
-          <w:rFonts w:ascii="Poppins" w:hAnsi="Poppins" w:cs="Poppins"/>
-          <w:color w:val="00B050"/>
-        </w:rPr>
-      </w:pPr>
-      <w:r>
-        <w:rPr>
-          <w:rFonts w:ascii="Poppins" w:hAnsi="Poppins" w:cs="Poppins"/>
-          <w:color w:val="00B050"/>
-        </w:rPr>
-        <w:t>Desarrollarás habilidades que fortalecerán tu liderazgo, pero Master Live Training va mucho más allá. Ha sido diseñado para desarrollar de manera integral a la persona que sostiene al líder, porque creemos que el liderazgo es una consecuencia de quién eres y no únicamente de lo que sabes.</w:t>
-      </w:r>
-    </w:p>
-    <w:p>
-      <w:pPr>
-        <w:spacing w:after="0"/>
-        <w:jc w:val="both"/>
-        <w:rPr>
-          <w:rFonts w:ascii="Poppins" w:hAnsi="Poppins" w:cs="Poppins"/>
-          <w:color w:val="00B050"/>
-        </w:rPr>
-      </w:pPr>
-    </w:p>
-    <w:p>
-      <w:pPr>
-        <w:spacing w:after="0"/>
-        <w:jc w:val="both"/>
-        <w:rPr>
-          <w:rFonts w:ascii="Poppins" w:hAnsi="Poppins" w:cs="Poppins"/>
-          <w:color w:val="00B050"/>
-        </w:rPr>
-      </w:pPr>
-      <w:r>
-        <w:rPr>
-          <w:rFonts w:ascii="Poppins" w:hAnsi="Poppins" w:cs="Poppins"/>
-          <w:color w:val="00B050"/>
-        </w:rPr>
-        <w:t>¿Necesito ser empresario o dirigir un equipo para participar?</w:t>
+        <w:t>Las sesiones serán grabadas y estarán disponibles para los participantes, de manera que puedas mantener la continuidad del proceso.</w:t>
+      </w:r>
+    </w:p>
+    <w:p>
+      <w:pPr>
+        <w:spacing w:after="0"/>
+        <w:jc w:val="both"/>
+        <w:rPr>
+          <w:rFonts w:ascii="Poppins" w:hAnsi="Poppins" w:cs="Poppins"/>
+          <w:color w:val="00B050"/>
+        </w:rPr>
+      </w:pPr>
+      <w:r>
+        <w:rPr>
+          <w:rFonts w:ascii="Poppins" w:hAnsi="Poppins" w:cs="Poppins"/>
+          <w:color w:val="00B050"/>
+        </w:rPr>
+        <w:t>Sin embargo, recomendamos participar en vivo siempre que sea posible, ya que gran parte del valor de la experiencia surge de la interacción con el grupo y de las conversaciones compartidas.</w:t>
+      </w:r>
+    </w:p>
+    <w:p>
+      <w:pPr>
+        <w:spacing w:after="0"/>
+        <w:jc w:val="both"/>
+        <w:rPr>
+          <w:rFonts w:ascii="Poppins" w:hAnsi="Poppins" w:cs="Poppins"/>
+          <w:color w:val="00B050"/>
+        </w:rPr>
+      </w:pPr>
+    </w:p>
+    <w:p>
+      <w:pPr>
+        <w:spacing w:after="0"/>
+        <w:jc w:val="both"/>
+        <w:rPr>
+          <w:rFonts w:ascii="Poppins" w:hAnsi="Poppins" w:cs="Poppins"/>
+          <w:color w:val="00B050"/>
+        </w:rPr>
+      </w:pPr>
+      <w:r>
+        <w:rPr>
+          <w:rFonts w:ascii="Poppins" w:hAnsi="Poppins" w:cs="Poppins"/>
+          <w:color w:val="00B050"/>
+        </w:rPr>
+        <w:t>¿Es un proceso de coaching o terapia?</w:t>
       </w:r>
     </w:p>
     <w:p>
@@ -5278,190 +5695,6 @@
           <w:rFonts w:ascii="Poppins" w:hAnsi="Poppins" w:cs="Poppins"/>
           <w:color w:val="00B050"/>
         </w:rPr>
-        <w:t>Aunque muchos participantes son empresarios, directivos o líderes de equipos, la experiencia está dirigida a cualquier persona comprometida con su crecimiento personal y profesional que desee desarrollar una vida con mayor claridad, dirección, coherencia e impacto.</w:t>
-      </w:r>
-    </w:p>
-    <w:p>
-      <w:pPr>
-        <w:spacing w:after="0"/>
-        <w:jc w:val="both"/>
-        <w:rPr>
-          <w:rFonts w:ascii="Poppins" w:hAnsi="Poppins" w:cs="Poppins"/>
-          <w:color w:val="00B050"/>
-        </w:rPr>
-      </w:pPr>
-    </w:p>
-    <w:p>
-      <w:pPr>
-        <w:spacing w:after="0"/>
-        <w:jc w:val="both"/>
-        <w:rPr>
-          <w:rFonts w:ascii="Poppins" w:hAnsi="Poppins" w:cs="Poppins"/>
-          <w:color w:val="00B050"/>
-        </w:rPr>
-      </w:pPr>
-      <w:r>
-        <w:rPr>
-          <w:rFonts w:ascii="Poppins" w:hAnsi="Poppins" w:cs="Poppins"/>
-          <w:color w:val="00B050"/>
-        </w:rPr>
-        <w:t>¿Cuánto tiempo debo dedicar al programa?</w:t>
-      </w:r>
-    </w:p>
-    <w:p>
-      <w:pPr>
-        <w:spacing w:after="0"/>
-        <w:jc w:val="both"/>
-        <w:rPr>
-          <w:rFonts w:ascii="Poppins" w:hAnsi="Poppins" w:cs="Poppins"/>
-          <w:color w:val="00B050"/>
-        </w:rPr>
-      </w:pPr>
-      <w:r>
-        <w:rPr>
-          <w:rFonts w:ascii="Poppins" w:hAnsi="Poppins" w:cs="Poppins"/>
-          <w:color w:val="00B050"/>
-        </w:rPr>
-        <w:t>Hemos diseñado una experiencia exigente pero compatible con la vida profesional de personas ocupadas.</w:t>
-      </w:r>
-    </w:p>
-    <w:p>
-      <w:pPr>
-        <w:spacing w:after="0"/>
-        <w:jc w:val="both"/>
-        <w:rPr>
-          <w:rFonts w:ascii="Poppins" w:hAnsi="Poppins" w:cs="Poppins"/>
-          <w:color w:val="00B050"/>
-        </w:rPr>
-      </w:pPr>
-      <w:r>
-        <w:rPr>
-          <w:rFonts w:ascii="Poppins" w:hAnsi="Poppins" w:cs="Poppins"/>
-          <w:color w:val="00B050"/>
-        </w:rPr>
-        <w:t>Además de las sesiones programadas, recomendamos destinar algunas horas semanales para la reflexión, las prácticas y la aplicación de los aprendizajes en tu vida personal y profesional.</w:t>
-      </w:r>
-    </w:p>
-    <w:p>
-      <w:pPr>
-        <w:spacing w:after="0"/>
-        <w:jc w:val="both"/>
-        <w:rPr>
-          <w:rFonts w:ascii="Poppins" w:hAnsi="Poppins" w:cs="Poppins"/>
-          <w:color w:val="00B050"/>
-        </w:rPr>
-      </w:pPr>
-    </w:p>
-    <w:p>
-      <w:pPr>
-        <w:spacing w:after="0"/>
-        <w:jc w:val="both"/>
-        <w:rPr>
-          <w:rFonts w:ascii="Poppins" w:hAnsi="Poppins" w:cs="Poppins"/>
-          <w:color w:val="00B050"/>
-        </w:rPr>
-      </w:pPr>
-      <w:r>
-        <w:rPr>
-          <w:rFonts w:ascii="Poppins" w:hAnsi="Poppins" w:cs="Poppins"/>
-          <w:color w:val="00B050"/>
-        </w:rPr>
-        <w:t>¿Qué sucede si no puedo asistir a alguna sesión?</w:t>
-      </w:r>
-    </w:p>
-    <w:p>
-      <w:pPr>
-        <w:spacing w:after="0"/>
-        <w:jc w:val="both"/>
-        <w:rPr>
-          <w:rFonts w:ascii="Poppins" w:hAnsi="Poppins" w:cs="Poppins"/>
-          <w:color w:val="00B050"/>
-        </w:rPr>
-      </w:pPr>
-      <w:r>
-        <w:rPr>
-          <w:rFonts w:ascii="Poppins" w:hAnsi="Poppins" w:cs="Poppins"/>
-          <w:color w:val="00B050"/>
-        </w:rPr>
-        <w:t>Las sesiones serán grabadas y estarán disponibles para los participantes, de manera que puedas mantener la continuidad del proceso.</w:t>
-      </w:r>
-    </w:p>
-    <w:p>
-      <w:pPr>
-        <w:spacing w:after="0"/>
-        <w:jc w:val="both"/>
-        <w:rPr>
-          <w:rFonts w:ascii="Poppins" w:hAnsi="Poppins" w:cs="Poppins"/>
-          <w:color w:val="00B050"/>
-        </w:rPr>
-      </w:pPr>
-      <w:r>
-        <w:rPr>
-          <w:rFonts w:ascii="Poppins" w:hAnsi="Poppins" w:cs="Poppins"/>
-          <w:color w:val="00B050"/>
-        </w:rPr>
-        <w:t>Sin embargo, recomendamos participar en vivo siempre que sea posible, ya que gran parte del valor de la experiencia surge de la interacción con el grupo y de las conversaciones compartidas.</w:t>
-      </w:r>
-    </w:p>
-    <w:p>
-      <w:pPr>
-        <w:spacing w:after="0"/>
-        <w:jc w:val="both"/>
-        <w:rPr>
-          <w:rFonts w:ascii="Poppins" w:hAnsi="Poppins" w:cs="Poppins"/>
-          <w:color w:val="00B050"/>
-        </w:rPr>
-      </w:pPr>
-    </w:p>
-    <w:p>
-      <w:pPr>
-        <w:spacing w:after="0"/>
-        <w:jc w:val="both"/>
-        <w:rPr>
-          <w:rFonts w:ascii="Poppins" w:hAnsi="Poppins" w:cs="Poppins"/>
-          <w:color w:val="00B050"/>
-        </w:rPr>
-      </w:pPr>
-      <w:r>
-        <w:rPr>
-          <w:rFonts w:ascii="Poppins" w:hAnsi="Poppins" w:cs="Poppins"/>
-          <w:color w:val="00B050"/>
-        </w:rPr>
-        <w:t>¿Es un proceso de coaching o terapia?</w:t>
-      </w:r>
-    </w:p>
-    <w:p>
-      <w:pPr>
-        <w:spacing w:after="0"/>
-        <w:jc w:val="both"/>
-        <w:rPr>
-          <w:rFonts w:ascii="Poppins" w:hAnsi="Poppins" w:cs="Poppins"/>
-          <w:color w:val="00B050"/>
-        </w:rPr>
-      </w:pPr>
-      <w:r>
-        <w:rPr>
-          <w:rFonts w:ascii="Poppins" w:hAnsi="Poppins" w:cs="Poppins"/>
-          <w:color w:val="00B050"/>
-        </w:rPr>
-        <w:t>No.</w:t>
-      </w:r>
-    </w:p>
-    <w:p>
-      <w:pPr>
-        <w:spacing w:after="0"/>
-        <w:jc w:val="both"/>
-        <w:rPr>
-          <w:rFonts w:ascii="Poppins" w:hAnsi="Poppins" w:cs="Poppins"/>
-          <w:color w:val="00B050"/>
-        </w:rPr>
-      </w:pPr>
-      <w:r>
-        <w:rPr>
-          <w:rFonts w:ascii="Poppins" w:hAnsi="Poppins" w:cs="Poppins"/>
-          <w:color w:val="00B050"/>
-        </w:rPr>
-        <w:lastRenderedPageBreak/>
         <w:t>Master Live Training es una experiencia de entrenamiento integral y desarrollo humano. Aunque promueve la reflexión profunda y el autoconocimiento, no reemplaza procesos terapéuticos ni intervenciones clínicas especializadas.</w:t>
       </w:r>
     </w:p>
@@ -5701,6 +5934,7 @@
           <w:rFonts w:ascii="Poppins" w:hAnsi="Poppins" w:cs="Poppins"/>
           <w:color w:val="00B050"/>
         </w:rPr>
+        <w:lastRenderedPageBreak/>
         <w:t>Sabemos que decidir invertir tiempo, energía y recursos en un proceso de desarrollo personal no es una decisión menor.</w:t>
       </w:r>
       <w:r>
@@ -5755,7 +5989,6 @@
           <w:rFonts w:ascii="Poppins" w:hAnsi="Poppins" w:cs="Poppins"/>
           <w:color w:val="00B050"/>
         </w:rPr>
-        <w:lastRenderedPageBreak/>
         <w:t>Nos comprometemos a crear un espacio seguro para la reflexión, el aprendizaje y el crecimiento. Nos comprometemos a entregarte herramientas, conversaciones, experiencias y recursos diseñados para generar cambios profundos y sostenibles.</w:t>
       </w:r>
     </w:p>
@@ -5909,6 +6142,7 @@
           <w:rFonts w:ascii="Poppins" w:hAnsi="Poppins" w:cs="Poppins"/>
           <w:b/>
           <w:bCs/>
+          <w:color w:val="00B050"/>
         </w:rPr>
       </w:pPr>
       <w:r>
@@ -5916,6 +6150,7 @@
           <w:rFonts w:ascii="Poppins" w:hAnsi="Poppins" w:cs="Poppins"/>
           <w:b/>
           <w:bCs/>
+          <w:color w:val="00B050"/>
         </w:rPr>
         <w:lastRenderedPageBreak/>
         <w:t>La vida que deseas construir ya te está llamando.</w:t>
@@ -5927,32 +6162,37 @@
         <w:jc w:val="both"/>
         <w:rPr>
           <w:rFonts w:ascii="Poppins" w:hAnsi="Poppins" w:cs="Poppins"/>
-        </w:rPr>
-      </w:pPr>
-    </w:p>
-    <w:p>
-      <w:pPr>
-        <w:spacing w:after="0"/>
-        <w:jc w:val="both"/>
-        <w:rPr>
-          <w:rFonts w:ascii="Poppins" w:hAnsi="Poppins" w:cs="Poppins"/>
-        </w:rPr>
-      </w:pPr>
-      <w:r>
-        <w:rPr>
-          <w:rFonts w:ascii="Poppins" w:hAnsi="Poppins" w:cs="Poppins"/>
+          <w:color w:val="00B050"/>
+        </w:rPr>
+      </w:pPr>
+    </w:p>
+    <w:p>
+      <w:pPr>
+        <w:spacing w:after="0"/>
+        <w:jc w:val="both"/>
+        <w:rPr>
+          <w:rFonts w:ascii="Poppins" w:hAnsi="Poppins" w:cs="Poppins"/>
+          <w:color w:val="00B050"/>
+        </w:rPr>
+      </w:pPr>
+      <w:r>
+        <w:rPr>
+          <w:rFonts w:ascii="Poppins" w:hAnsi="Poppins" w:cs="Poppins"/>
+          <w:color w:val="00B050"/>
         </w:rPr>
         <w:t>Quizás por eso llegaste hasta aquí.</w:t>
       </w:r>
       <w:r>
         <w:rPr>
           <w:rFonts w:ascii="Poppins" w:hAnsi="Poppins" w:cs="Poppins"/>
+          <w:color w:val="00B050"/>
         </w:rPr>
         <w:t xml:space="preserve"> </w:t>
       </w:r>
       <w:r>
         <w:rPr>
           <w:rFonts w:ascii="Poppins" w:hAnsi="Poppins" w:cs="Poppins"/>
+          <w:color w:val="00B050"/>
         </w:rPr>
         <w:t>Tal vez porque una parte de ti sabe que ha llegado el momento de dedicar menos energía a intentar hacerlo todo mejor y más energía a desarrollar a la persona que sostiene todo aquello que has construido.</w:t>
       </w:r>
@@ -5963,11 +6203,13 @@
         <w:jc w:val="both"/>
         <w:rPr>
           <w:rFonts w:ascii="Poppins" w:hAnsi="Poppins" w:cs="Poppins"/>
-        </w:rPr>
-      </w:pPr>
-      <w:r>
-        <w:rPr>
-          <w:rFonts w:ascii="Poppins" w:hAnsi="Poppins" w:cs="Poppins"/>
+          <w:color w:val="00B050"/>
+        </w:rPr>
+      </w:pPr>
+      <w:r>
+        <w:rPr>
+          <w:rFonts w:ascii="Poppins" w:hAnsi="Poppins" w:cs="Poppins"/>
+          <w:color w:val="00B050"/>
         </w:rPr>
         <w:t>Has dedicado años a tu carrera.</w:t>
       </w:r>
@@ -5978,11 +6220,13 @@
         <w:jc w:val="both"/>
         <w:rPr>
           <w:rFonts w:ascii="Poppins" w:hAnsi="Poppins" w:cs="Poppins"/>
-        </w:rPr>
-      </w:pPr>
-      <w:r>
-        <w:rPr>
-          <w:rFonts w:ascii="Poppins" w:hAnsi="Poppins" w:cs="Poppins"/>
+          <w:color w:val="00B050"/>
+        </w:rPr>
+      </w:pPr>
+      <w:r>
+        <w:rPr>
+          <w:rFonts w:ascii="Poppins" w:hAnsi="Poppins" w:cs="Poppins"/>
+          <w:color w:val="00B050"/>
         </w:rPr>
         <w:t>A tu empresa.</w:t>
       </w:r>
@@ -5993,11 +6237,13 @@
         <w:jc w:val="both"/>
         <w:rPr>
           <w:rFonts w:ascii="Poppins" w:hAnsi="Poppins" w:cs="Poppins"/>
-        </w:rPr>
-      </w:pPr>
-      <w:r>
-        <w:rPr>
-          <w:rFonts w:ascii="Poppins" w:hAnsi="Poppins" w:cs="Poppins"/>
+          <w:color w:val="00B050"/>
+        </w:rPr>
+      </w:pPr>
+      <w:r>
+        <w:rPr>
+          <w:rFonts w:ascii="Poppins" w:hAnsi="Poppins" w:cs="Poppins"/>
+          <w:color w:val="00B050"/>
         </w:rPr>
         <w:t>A tu familia.</w:t>
       </w:r>
@@ -6008,11 +6254,13 @@
         <w:jc w:val="both"/>
         <w:rPr>
           <w:rFonts w:ascii="Poppins" w:hAnsi="Poppins" w:cs="Poppins"/>
-        </w:rPr>
-      </w:pPr>
-      <w:r>
-        <w:rPr>
-          <w:rFonts w:ascii="Poppins" w:hAnsi="Poppins" w:cs="Poppins"/>
+          <w:color w:val="00B050"/>
+        </w:rPr>
+      </w:pPr>
+      <w:r>
+        <w:rPr>
+          <w:rFonts w:ascii="Poppins" w:hAnsi="Poppins" w:cs="Poppins"/>
+          <w:color w:val="00B050"/>
         </w:rPr>
         <w:t>A tus responsabilidades.</w:t>
       </w:r>
@@ -6023,11 +6271,13 @@
         <w:jc w:val="both"/>
         <w:rPr>
           <w:rFonts w:ascii="Poppins" w:hAnsi="Poppins" w:cs="Poppins"/>
-        </w:rPr>
-      </w:pPr>
-      <w:r>
-        <w:rPr>
-          <w:rFonts w:ascii="Poppins" w:hAnsi="Poppins" w:cs="Poppins"/>
+          <w:color w:val="00B050"/>
+        </w:rPr>
+      </w:pPr>
+      <w:r>
+        <w:rPr>
+          <w:rFonts w:ascii="Poppins" w:hAnsi="Poppins" w:cs="Poppins"/>
+          <w:color w:val="00B050"/>
         </w:rPr>
         <w:t>Ahora es momento de dedicar tiempo a quien hace posible todo lo demás.</w:t>
       </w:r>
@@ -6038,11 +6288,13 @@
         <w:jc w:val="both"/>
         <w:rPr>
           <w:rFonts w:ascii="Poppins" w:hAnsi="Poppins" w:cs="Poppins"/>
-        </w:rPr>
-      </w:pPr>
-      <w:r>
-        <w:rPr>
-          <w:rFonts w:ascii="Poppins" w:hAnsi="Poppins" w:cs="Poppins"/>
+          <w:color w:val="00B050"/>
+        </w:rPr>
+      </w:pPr>
+      <w:r>
+        <w:rPr>
+          <w:rFonts w:ascii="Poppins" w:hAnsi="Poppins" w:cs="Poppins"/>
+          <w:color w:val="00B050"/>
         </w:rPr>
         <w:t>No porque estés roto.</w:t>
       </w:r>
@@ -6053,11 +6305,13 @@
         <w:jc w:val="both"/>
         <w:rPr>
           <w:rFonts w:ascii="Poppins" w:hAnsi="Poppins" w:cs="Poppins"/>
-        </w:rPr>
-      </w:pPr>
-      <w:r>
-        <w:rPr>
-          <w:rFonts w:ascii="Poppins" w:hAnsi="Poppins" w:cs="Poppins"/>
+          <w:color w:val="00B050"/>
+        </w:rPr>
+      </w:pPr>
+      <w:r>
+        <w:rPr>
+          <w:rFonts w:ascii="Poppins" w:hAnsi="Poppins" w:cs="Poppins"/>
+          <w:color w:val="00B050"/>
         </w:rPr>
         <w:t>No porque estés perdido.</w:t>
       </w:r>
@@ -6068,11 +6322,13 @@
         <w:jc w:val="both"/>
         <w:rPr>
           <w:rFonts w:ascii="Poppins" w:hAnsi="Poppins" w:cs="Poppins"/>
-        </w:rPr>
-      </w:pPr>
-      <w:r>
-        <w:rPr>
-          <w:rFonts w:ascii="Poppins" w:hAnsi="Poppins" w:cs="Poppins"/>
+          <w:color w:val="00B050"/>
+        </w:rPr>
+      </w:pPr>
+      <w:r>
+        <w:rPr>
+          <w:rFonts w:ascii="Poppins" w:hAnsi="Poppins" w:cs="Poppins"/>
+          <w:color w:val="00B050"/>
         </w:rPr>
         <w:t>No porque hayas fracasado.</w:t>
       </w:r>
@@ -6083,11 +6339,13 @@
         <w:jc w:val="both"/>
         <w:rPr>
           <w:rFonts w:ascii="Poppins" w:hAnsi="Poppins" w:cs="Poppins"/>
-        </w:rPr>
-      </w:pPr>
-      <w:r>
-        <w:rPr>
-          <w:rFonts w:ascii="Poppins" w:hAnsi="Poppins" w:cs="Poppins"/>
+          <w:color w:val="00B050"/>
+        </w:rPr>
+      </w:pPr>
+      <w:r>
+        <w:rPr>
+          <w:rFonts w:ascii="Poppins" w:hAnsi="Poppins" w:cs="Poppins"/>
+          <w:color w:val="00B050"/>
         </w:rPr>
         <w:t>Sino porque estás creciendo.</w:t>
       </w:r>
@@ -6098,20 +6356,23 @@
         <w:jc w:val="both"/>
         <w:rPr>
           <w:rFonts w:ascii="Poppins" w:hAnsi="Poppins" w:cs="Poppins"/>
-        </w:rPr>
-      </w:pPr>
-    </w:p>
-    <w:p>
-      <w:pPr>
-        <w:spacing w:after="0"/>
-        <w:jc w:val="both"/>
-        <w:rPr>
-          <w:rFonts w:ascii="Poppins" w:hAnsi="Poppins" w:cs="Poppins"/>
-        </w:rPr>
-      </w:pPr>
-      <w:r>
-        <w:rPr>
-          <w:rFonts w:ascii="Poppins" w:hAnsi="Poppins" w:cs="Poppins"/>
+          <w:color w:val="00B050"/>
+        </w:rPr>
+      </w:pPr>
+    </w:p>
+    <w:p>
+      <w:pPr>
+        <w:spacing w:after="0"/>
+        <w:jc w:val="both"/>
+        <w:rPr>
+          <w:rFonts w:ascii="Poppins" w:hAnsi="Poppins" w:cs="Poppins"/>
+          <w:color w:val="00B050"/>
+        </w:rPr>
+      </w:pPr>
+      <w:r>
+        <w:rPr>
+          <w:rFonts w:ascii="Poppins" w:hAnsi="Poppins" w:cs="Poppins"/>
+          <w:color w:val="00B050"/>
         </w:rPr>
         <w:t>Y cada nueva etapa de la vida exige una nueva versión de nosotros mismos.</w:t>
       </w:r>
@@ -6122,11 +6383,13 @@
         <w:jc w:val="both"/>
         <w:rPr>
           <w:rFonts w:ascii="Poppins" w:hAnsi="Poppins" w:cs="Poppins"/>
-        </w:rPr>
-      </w:pPr>
-      <w:r>
-        <w:rPr>
-          <w:rFonts w:ascii="Poppins" w:hAnsi="Poppins" w:cs="Poppins"/>
+          <w:color w:val="00B050"/>
+        </w:rPr>
+      </w:pPr>
+      <w:r>
+        <w:rPr>
+          <w:rFonts w:ascii="Poppins" w:hAnsi="Poppins" w:cs="Poppins"/>
+          <w:color w:val="00B050"/>
         </w:rPr>
         <w:t>La pregunta no es si tienes potencial para crecer.</w:t>
       </w:r>
@@ -6137,11 +6400,13 @@
         <w:jc w:val="both"/>
         <w:rPr>
           <w:rFonts w:ascii="Poppins" w:hAnsi="Poppins" w:cs="Poppins"/>
-        </w:rPr>
-      </w:pPr>
-      <w:r>
-        <w:rPr>
-          <w:rFonts w:ascii="Poppins" w:hAnsi="Poppins" w:cs="Poppins"/>
+          <w:color w:val="00B050"/>
+        </w:rPr>
+      </w:pPr>
+      <w:r>
+        <w:rPr>
+          <w:rFonts w:ascii="Poppins" w:hAnsi="Poppins" w:cs="Poppins"/>
+          <w:color w:val="00B050"/>
         </w:rPr>
         <w:t>La pregunta es si estás dispuesto a invertir en la persona que sostendrá la vida, el liderazgo y el impacto que deseas construir durante los próximos años.</w:t>
       </w:r>
@@ -6152,11 +6417,13 @@
         <w:jc w:val="both"/>
         <w:rPr>
           <w:rFonts w:ascii="Poppins" w:hAnsi="Poppins" w:cs="Poppins"/>
-        </w:rPr>
-      </w:pPr>
-      <w:r>
-        <w:rPr>
-          <w:rFonts w:ascii="Poppins" w:hAnsi="Poppins" w:cs="Poppins"/>
+          <w:color w:val="00B050"/>
+        </w:rPr>
+      </w:pPr>
+      <w:r>
+        <w:rPr>
+          <w:rFonts w:ascii="Poppins" w:hAnsi="Poppins" w:cs="Poppins"/>
+          <w:color w:val="00B050"/>
         </w:rPr>
         <w:t>Si sientes que este es tu momento, estaremos encantados de recorrer este camino contigo.</w:t>
       </w:r>
@@ -6167,6 +6434,7 @@
         <w:jc w:val="both"/>
         <w:rPr>
           <w:rFonts w:ascii="Poppins" w:hAnsi="Poppins" w:cs="Poppins"/>
+          <w:color w:val="00B050"/>
         </w:rPr>
       </w:pPr>
     </w:p>
@@ -6178,6 +6446,7 @@
           <w:rFonts w:ascii="Poppins" w:hAnsi="Poppins" w:cs="Poppins"/>
           <w:b/>
           <w:bCs/>
+          <w:color w:val="00B050"/>
         </w:rPr>
       </w:pPr>
       <w:r>
@@ -6185,6 +6454,7 @@
           <w:rFonts w:ascii="Poppins" w:hAnsi="Poppins" w:cs="Poppins"/>
           <w:b/>
           <w:bCs/>
+          <w:color w:val="00B050"/>
         </w:rPr>
         <w:t>Primera Generación Master Live Training</w:t>
       </w:r>
@@ -6195,20 +6465,23 @@
         <w:jc w:val="both"/>
         <w:rPr>
           <w:rFonts w:ascii="Poppins" w:hAnsi="Poppins" w:cs="Poppins"/>
-        </w:rPr>
-      </w:pPr>
-    </w:p>
-    <w:p>
-      <w:pPr>
-        <w:spacing w:after="0"/>
-        <w:jc w:val="both"/>
-        <w:rPr>
-          <w:rFonts w:ascii="Poppins" w:hAnsi="Poppins" w:cs="Poppins"/>
-        </w:rPr>
-      </w:pPr>
-      <w:r>
-        <w:rPr>
-          <w:rFonts w:ascii="Poppins" w:hAnsi="Poppins" w:cs="Poppins"/>
+          <w:color w:val="00B050"/>
+        </w:rPr>
+      </w:pPr>
+    </w:p>
+    <w:p>
+      <w:pPr>
+        <w:spacing w:after="0"/>
+        <w:jc w:val="both"/>
+        <w:rPr>
+          <w:rFonts w:ascii="Poppins" w:hAnsi="Poppins" w:cs="Poppins"/>
+          <w:color w:val="00B050"/>
+        </w:rPr>
+      </w:pPr>
+      <w:r>
+        <w:rPr>
+          <w:rFonts w:ascii="Poppins" w:hAnsi="Poppins" w:cs="Poppins"/>
+          <w:color w:val="00B050"/>
         </w:rPr>
         <w:t>20 participantes · 90 días de entrenamiento integral · Una experiencia diseñada para transformar la forma en que te conoces, lideras y construyes tu vida.</w:t>
       </w:r>
@@ -6219,6 +6492,7 @@
         <w:jc w:val="both"/>
         <w:rPr>
           <w:rFonts w:ascii="Poppins" w:hAnsi="Poppins" w:cs="Poppins"/>
+          <w:color w:val="00B050"/>
         </w:rPr>
       </w:pPr>
     </w:p>
@@ -6230,7 +6504,7 @@
           <w:rFonts w:ascii="Poppins" w:hAnsi="Poppins" w:cs="Poppins"/>
           <w:b/>
           <w:bCs/>
-          <w:color w:val="000000" w:themeColor="text1"/>
+          <w:color w:val="00B050"/>
         </w:rPr>
       </w:pPr>
       <w:r>
@@ -6238,7 +6512,7 @@
           <w:rFonts w:ascii="Poppins" w:hAnsi="Poppins" w:cs="Poppins"/>
           <w:b/>
           <w:bCs/>
-          <w:color w:val="000000" w:themeColor="text1"/>
+          <w:color w:val="00B050"/>
           <w:highlight w:val="yellow"/>
         </w:rPr>
         <w:t>[Aplicar a la Primera Generación]</w:t>
@@ -6250,15 +6524,17 @@
         <w:jc w:val="both"/>
         <w:rPr>
           <w:rFonts w:ascii="Poppins" w:hAnsi="Poppins" w:cs="Poppins"/>
-        </w:rPr>
-      </w:pPr>
-    </w:p>
-    <w:p>
-      <w:pPr>
-        <w:spacing w:after="0"/>
-        <w:jc w:val="both"/>
-        <w:rPr>
-          <w:rFonts w:ascii="Poppins" w:hAnsi="Poppins" w:cs="Poppins"/>
+          <w:color w:val="00B050"/>
+        </w:rPr>
+      </w:pPr>
+    </w:p>
+    <w:p>
+      <w:pPr>
+        <w:spacing w:after="0"/>
+        <w:jc w:val="both"/>
+        <w:rPr>
+          <w:rFonts w:ascii="Poppins" w:hAnsi="Poppins" w:cs="Poppins"/>
+          <w:color w:val="00B050"/>
         </w:rPr>
       </w:pPr>
     </w:p>

</xml_diff>